<commit_message>
Complete Tammy 2 1000-entry V3 example
</commit_message>
<xml_diff>
--- a/examples/tammy2/reference/TAMMY_CANON_V3_1_MASTER_LEDGER.docx
+++ b/examples/tammy2/reference/TAMMY_CANON_V3_1_MASTER_LEDGER.docx
@@ -5,3012 +5,906 @@
     <w:p>
       <w:pPr>
         <w:pStyle w:val="Title"/>
-        <w:jc w:val="center"/>
       </w:pPr>
       <w:r>
-        <w:t>TAMMY LYNN MERCER — V3 MASTER CANON LEDGER</w:t>
+        <w:t>Tammy Lynn Mercer — Life Reference</w:t>
       </w:r>
     </w:p>
-    <w:p>
-      <w:pPr>
-        <w:jc w:val="center"/>
-      </w:pPr>
-      <w:r>
-        <w:rPr>
-          <w:i/>
-          <w:sz w:val="19"/>
-        </w:rPr>
-        <w:t>Status: Locked working canon for the 1,000+ entry diary rewrite — revision 3.1</w:t>
-      </w:r>
-    </w:p>
-    <w:p>
-      <w:r>
-        <w:rPr>
-          <w:b/>
-        </w:rPr>
-        <w:t>Current story date:</w:t>
-      </w:r>
-      <w:r>
-        <w:t xml:space="preserve"> October 20, 2026</w:t>
-      </w:r>
-    </w:p>
-    <w:p/>
     <w:p>
       <w:pPr>
         <w:pStyle w:val="Heading1"/>
       </w:pPr>
       <w:r>
-        <w:t>PURPOSE</w:t>
+        <w:t>TAMMY LYNN MERCER — PERSONAL PROFILE AND LIFE REFERENCE</w:t>
       </w:r>
     </w:p>
     <w:p>
       <w:r>
-        <w:t>This ledger is the continuity authority for Tammy V3. The 300-entry V2 diary is source material and a story skeleton, but V3 replaces it as Tammy's autobiography. If a V3 diary entry conflicts with this ledger, the diary entry should be corrected unless the ledger itself is deliberately revised.</w:t>
+        <w:t>Updated October 20, 2026</w:t>
       </w:r>
     </w:p>
-    <w:p/>
-    <w:p>
-      <w:r>
-        <w:t>All contact information, addresses, employers, schools, congregation names, and incidental people in this ledger are fictional story canon unless they are clearly ordinary real-world institutions such as Trident Technical College or the University of South Carolina. Phone numbers use the fictional 555-01xx range and email addresses use example.com.</w:t>
-      </w:r>
-    </w:p>
-    <w:p/>
     <w:p>
       <w:pPr>
         <w:pStyle w:val="Heading1"/>
       </w:pPr>
       <w:r>
-        <w:t>CORE IDENTITY</w:t>
+        <w:t>IDENTITY</w:t>
       </w:r>
     </w:p>
     <w:p>
       <w:r>
-        <w:rPr>
-          <w:b/>
-        </w:rPr>
-        <w:t>Full legal name:</w:t>
-      </w:r>
-      <w:r>
-        <w:t xml:space="preserve"> Tammy Lynn Mercer</w:t>
+        <w:t>Full name: Tammy Lynn Mercer</w:t>
       </w:r>
     </w:p>
     <w:p>
       <w:r>
-        <w:rPr>
-          <w:b/>
-        </w:rPr>
-        <w:t>Preferred name:</w:t>
-      </w:r>
-      <w:r>
-        <w:t xml:space="preserve"> Tammy</w:t>
+        <w:t>Born: November 6, 1990</w:t>
       </w:r>
     </w:p>
     <w:p>
       <w:r>
-        <w:rPr>
-          <w:b/>
-        </w:rPr>
-        <w:t>Date of birth:</w:t>
-      </w:r>
-      <w:r>
-        <w:t xml:space="preserve"> November 6, 1990</w:t>
+        <w:t>Birthplace: Belleville, Illinois</w:t>
       </w:r>
     </w:p>
     <w:p>
       <w:r>
-        <w:rPr>
-          <w:b/>
-        </w:rPr>
-        <w:t>Age on October 20, 2026:</w:t>
-      </w:r>
-      <w:r>
-        <w:t xml:space="preserve"> 35 (turns 36 on November 6, 2026)</w:t>
+        <w:t>Age: 35</w:t>
       </w:r>
     </w:p>
     <w:p>
       <w:r>
-        <w:rPr>
-          <w:b/>
-        </w:rPr>
-        <w:t>Birthplace:</w:t>
-      </w:r>
-      <w:r>
-        <w:t xml:space="preserve"> Belleville, Illinois, St. Clair County</w:t>
+        <w:t>Height: 5 ft 6 in</w:t>
       </w:r>
     </w:p>
     <w:p>
       <w:r>
-        <w:rPr>
-          <w:b/>
-        </w:rPr>
-        <w:t>Raised:</w:t>
-      </w:r>
-      <w:r>
-        <w:t xml:space="preserve"> Metro East, Illinois side, south of East St. Louis</w:t>
+        <w:t>Hair: medium brown, naturally wavy</w:t>
       </w:r>
     </w:p>
     <w:p>
       <w:r>
-        <w:rPr>
-          <w:b/>
-        </w:rPr>
-        <w:t>Childhood home:</w:t>
-      </w:r>
-      <w:r>
-        <w:t xml:space="preserve"> Lot 38, River Bend Mobile Home Park, south St. Clair County, Illinois</w:t>
+        <w:t>Eyes: hazel-green</w:t>
       </w:r>
     </w:p>
     <w:p>
       <w:r>
-        <w:rPr>
-          <w:b/>
-        </w:rPr>
-        <w:t>Religion/upbringing:</w:t>
-      </w:r>
-      <w:r>
-        <w:t xml:space="preserve"> Church of Christ; Fairview Church of Christ congregation</w:t>
+        <w:t>Current home: 1980 Chris-Craft 35, Slip D-2, St. Johns Yacht Harbor, 2408 Maybank Hwy, Johns Island, South Carolina 29455</w:t>
       </w:r>
     </w:p>
     <w:p>
       <w:r>
-        <w:rPr>
-          <w:b/>
-        </w:rPr>
-        <w:t>Adult faith:</w:t>
-      </w:r>
-      <w:r>
-        <w:t xml:space="preserve"> still believes in God and carries Church of Christ language and moral formation, but is more questioning and less doctrinally rigid than she was as a teenager</w:t>
+        <w:t>Current phone: 843-555-0147</w:t>
       </w:r>
     </w:p>
     <w:p>
       <w:r>
-        <w:rPr>
-          <w:b/>
-        </w:rPr>
-        <w:t>Height:</w:t>
-      </w:r>
-      <w:r>
-        <w:t xml:space="preserve"> 5 ft 6 in</w:t>
+        <w:t>Current email: tammy.mercer90@example.com</w:t>
       </w:r>
     </w:p>
-    <w:p>
-      <w:r>
-        <w:rPr>
-          <w:b/>
-        </w:rPr>
-        <w:t>Current weight:</w:t>
-      </w:r>
-      <w:r>
-        <w:t xml:space="preserve"> about 168 lb; fluctuates with school/work stress</w:t>
-      </w:r>
-    </w:p>
-    <w:p>
-      <w:r>
-        <w:rPr>
-          <w:b/>
-        </w:rPr>
-        <w:t>Hair:</w:t>
-      </w:r>
-      <w:r>
-        <w:t xml:space="preserve"> medium brown, naturally wavy</w:t>
-      </w:r>
-    </w:p>
-    <w:p>
-      <w:r>
-        <w:rPr>
-          <w:b/>
-        </w:rPr>
-        <w:t>Eyes:</w:t>
-      </w:r>
-      <w:r>
-        <w:t xml:space="preserve"> hazel-green</w:t>
-      </w:r>
-    </w:p>
-    <w:p>
-      <w:r>
-        <w:rPr>
-          <w:b/>
-        </w:rPr>
-        <w:t>Build:</w:t>
-      </w:r>
-      <w:r>
-        <w:t xml:space="preserve"> curvy; was heavy as a child, leaner through late teens and twenties, fuller again in her thirties</w:t>
-      </w:r>
-    </w:p>
-    <w:p>
-      <w:r>
-        <w:rPr>
-          <w:b/>
-        </w:rPr>
-        <w:t>Dominant hand:</w:t>
-      </w:r>
-      <w:r>
-        <w:t xml:space="preserve"> right</w:t>
-      </w:r>
-    </w:p>
-    <w:p/>
     <w:p>
       <w:pPr>
         <w:pStyle w:val="Heading1"/>
       </w:pPr>
       <w:r>
-        <w:t>PARENTS</w:t>
+        <w:t>FAMILY</w:t>
       </w:r>
     </w:p>
     <w:p>
       <w:r>
-        <w:rPr>
-          <w:b/>
-        </w:rPr>
-        <w:t>Father:</w:t>
-      </w:r>
-      <w:r>
-        <w:t xml:space="preserve"> Raymond "Ray" Mercer</w:t>
+        <w:t>Father: Raymond “Ray” Mercer, born March 18, 1962; died July 19, 2024. Career welder and fabricator. Buried at Walnut Hill Cemetery, 1101 Mascoutah Ave., Belleville, Illinois, Section 15, Lot 248, Grave 3.</w:t>
       </w:r>
     </w:p>
     <w:p>
       <w:r>
-        <w:rPr>
-          <w:b/>
-        </w:rPr>
-        <w:t>Born:</w:t>
-      </w:r>
-      <w:r>
-        <w:t xml:space="preserve"> March 18, 1962</w:t>
+        <w:t>Mother: Deborah “Debbie” Bennett Mercer, born September 2, 1964. Cell 618-555-0116. Home line 618-555-0138. Email debbie.mercer64@example.com. Lives at Lot 38, River Bend Mobile Home Park, south St. Clair County, Illinois.</w:t>
       </w:r>
     </w:p>
     <w:p>
       <w:r>
-        <w:rPr>
-          <w:b/>
-        </w:rPr>
-        <w:t>Raised:</w:t>
-      </w:r>
-      <w:r>
-        <w:t xml:space="preserve"> southern Illinois / Metro East working-class family</w:t>
+        <w:t>Parents married June 14, 1984.</w:t>
       </w:r>
     </w:p>
     <w:p>
       <w:r>
-        <w:rPr>
-          <w:b/>
-        </w:rPr>
-        <w:t>Occupation:</w:t>
-      </w:r>
-      <w:r>
-        <w:t xml:space="preserve"> career welder and fabricator; Gateway Fabrication &amp; Tank (fictional), roughly 1982-2015</w:t>
+        <w:t>Brother: Jason Raymond Mercer, born April 11, 1985. Wife Melissa Grant Mercer, born July 30, 1986. Children Tyler, born May 6, 2012; Emily, born September 17, 2015.</w:t>
       </w:r>
     </w:p>
     <w:p>
       <w:r>
-        <w:rPr>
-          <w:b/>
-        </w:rPr>
-        <w:t>Personality:</w:t>
-      </w:r>
-      <w:r>
-        <w:t xml:space="preserve"> quiet, mechanically gifted, proud, practical, funny in a dry way; shows love by fixing, teaching, working, and making sure people can get home safely</w:t>
+        <w:t>Brother: Michael “Mike” David Mercer, born August 24, 1987. Wife Kendra Walsh Mercer, born December 3, 1988. Children Sophie, born February 22, 2016; Luke, born November 1, 2019.</w:t>
       </w:r>
     </w:p>
     <w:p>
       <w:r>
-        <w:rPr>
-          <w:b/>
-        </w:rPr>
-        <w:t>Health:</w:t>
-      </w:r>
-      <w:r>
-        <w:t xml:space="preserve"> heart attack June 2015; later workup shows serious occupational lung and cardiovascular damage from decades of fumes, dust, gases, and welding exposure; permanently barred from welding</w:t>
+        <w:t>Paternal grandparents: Walter James Mercer (January 27, 1935-August 3, 2014) and June Evelyn Mercer (born June 12, 1937).</w:t>
       </w:r>
     </w:p>
     <w:p>
       <w:r>
-        <w:rPr>
-          <w:b/>
-        </w:rPr>
-        <w:t>Health decline / death:</w:t>
-      </w:r>
-      <w:r>
-        <w:t xml:space="preserve"> after years of progressive cardiopulmonary disease, Ray dies July 19, 2024, age 62, after an acute respiratory/cardiac collapse following several hospitalizations. Tammy is with Debbie at the hospital before he dies.</w:t>
+        <w:t>Maternal grandparents: Harold Bennett (February 5, 1938-November 19, 2020) and Ruth Elaine Bennett (born October 21, 1940).</w:t>
       </w:r>
     </w:p>
     <w:p>
       <w:r>
-        <w:rPr>
-          <w:b/>
-        </w:rPr>
-        <w:t>Burial:</w:t>
-      </w:r>
-      <w:r>
-        <w:t xml:space="preserve"> Walnut Hill Cemetery, 1101 Mascoutah Ave., Belleville, IL 62220. Story plot: Section 15, Lot 248, Grave 3 (fictional plot placement within the real public cemetery). Cemetery office: 618-257-3330.</w:t>
+        <w:t>Cousins: Kelly Bennett (born August 14, 1989), Derek Bennett (born January 30, 1992), April Mercer (born April 19, 1990).</w:t>
       </w:r>
     </w:p>
-    <w:p>
-      <w:r>
-        <w:rPr>
-          <w:b/>
-        </w:rPr>
-        <w:t>Final advice to Tammy:</w:t>
-      </w:r>
-      <w:r>
-        <w:t xml:space="preserve"> during his last good year he tells her that she has already given the family years and that they should not get to keep needing her forever.</w:t>
-      </w:r>
-    </w:p>
-    <w:p>
-      <w:r>
-        <w:rPr>
-          <w:b/>
-        </w:rPr>
-        <w:t>Current status:</w:t>
-      </w:r>
-      <w:r>
-        <w:t xml:space="preserve"> deceased July 19, 2024</w:t>
-      </w:r>
-    </w:p>
-    <w:p>
-      <w:r>
-        <w:rPr>
-          <w:b/>
-        </w:rPr>
-        <w:t>Old cell retained in Tammy's contacts:</w:t>
-      </w:r>
-      <w:r>
-        <w:t xml:space="preserve"> 618-555-0118</w:t>
-      </w:r>
-    </w:p>
-    <w:p/>
-    <w:p>
-      <w:r>
-        <w:rPr>
-          <w:b/>
-        </w:rPr>
-        <w:t>Mother:</w:t>
-      </w:r>
-      <w:r>
-        <w:t xml:space="preserve"> Deborah "Debbie" Bennett Mercer</w:t>
-      </w:r>
-    </w:p>
-    <w:p>
-      <w:r>
-        <w:rPr>
-          <w:b/>
-        </w:rPr>
-        <w:t>Born:</w:t>
-      </w:r>
-      <w:r>
-        <w:t xml:space="preserve"> September 2, 1964</w:t>
-      </w:r>
-    </w:p>
-    <w:p>
-      <w:r>
-        <w:rPr>
-          <w:b/>
-        </w:rPr>
-        <w:t>Occupation:</w:t>
-      </w:r>
-      <w:r>
-        <w:t xml:space="preserve"> stay-at-home mother throughout Tammy's childhood; household manager, church volunteer, later primary organizer of Ray's medical life</w:t>
-      </w:r>
-    </w:p>
-    <w:p>
-      <w:r>
-        <w:rPr>
-          <w:b/>
-        </w:rPr>
-        <w:t>Personality:</w:t>
-      </w:r>
-      <w:r>
-        <w:t xml:space="preserve"> frugal, traditional, loving, emotionally tougher than Tammy, observant, capable of making a dollar stretch impossibly far</w:t>
-      </w:r>
-    </w:p>
-    <w:p>
-      <w:r>
-        <w:rPr>
-          <w:b/>
-        </w:rPr>
-        <w:t>Current status:</w:t>
-      </w:r>
-      <w:r>
-        <w:t xml:space="preserve"> alive in 2026; still lives in the family mobile home at River Bend Mobile Home Park.</w:t>
-      </w:r>
-    </w:p>
-    <w:p>
-      <w:r>
-        <w:rPr>
-          <w:b/>
-        </w:rPr>
-        <w:t>Cell phone:</w:t>
-      </w:r>
-      <w:r>
-        <w:t xml:space="preserve"> 618-555-0116</w:t>
-      </w:r>
-    </w:p>
-    <w:p>
-      <w:r>
-        <w:rPr>
-          <w:b/>
-        </w:rPr>
-        <w:t>Trailer landline:</w:t>
-      </w:r>
-      <w:r>
-        <w:t xml:space="preserve"> 618-555-0138</w:t>
-      </w:r>
-    </w:p>
-    <w:p>
-      <w:r>
-        <w:rPr>
-          <w:b/>
-        </w:rPr>
-        <w:t>Email:</w:t>
-      </w:r>
-      <w:r>
-        <w:t xml:space="preserve"> debbie.mercer64@example.com</w:t>
-      </w:r>
-    </w:p>
-    <w:p/>
-    <w:p>
-      <w:r>
-        <w:rPr>
-          <w:b/>
-        </w:rPr>
-        <w:t>Parents married:</w:t>
-      </w:r>
-      <w:r>
-        <w:t xml:space="preserve"> June 14, 1984</w:t>
-      </w:r>
-    </w:p>
-    <w:p>
-      <w:r>
-        <w:rPr>
-          <w:b/>
-        </w:rPr>
-        <w:t>Marriage character:</w:t>
-      </w:r>
-      <w:r>
-        <w:t xml:space="preserve"> ordinary, durable, sometimes sharp-edged, deeply loyal; money and Ray's work were recurring sources of stress, not lack of love</w:t>
-      </w:r>
-    </w:p>
-    <w:p/>
     <w:p>
       <w:pPr>
         <w:pStyle w:val="Heading1"/>
       </w:pPr>
       <w:r>
-        <w:t>BROTHERS</w:t>
+        <w:t>CHILDHOOD AND SCHOOL</w:t>
       </w:r>
     </w:p>
     <w:p>
       <w:r>
-        <w:t>Jason Raymond Mercer</w:t>
+        <w:t>Raised at River Bend Mobile Home Park on the Illinois side of the Metro East, south of East St. Louis. Church of Christ upbringing at Fairview Church of Christ.</w:t>
       </w:r>
     </w:p>
     <w:p>
       <w:r>
-        <w:rPr>
-          <w:b/>
-        </w:rPr>
-        <w:t>Born:</w:t>
-      </w:r>
-      <w:r>
-        <w:t xml:space="preserve"> April 11, 1985</w:t>
+        <w:t>Tammy was expelled during her first third-grade year in February 2000 after intervening in a fight to protect classmate Renee Carter and continuing to hit fifth-grader Tasha after the immediate threat had ended. She repeated third grade because the expulsion cost the school year, not because of academic weakness.</w:t>
       </w:r>
     </w:p>
     <w:p>
       <w:r>
-        <w:rPr>
-          <w:b/>
-        </w:rPr>
-        <w:t>Relationship to Tammy:</w:t>
-      </w:r>
-      <w:r>
-        <w:t xml:space="preserve"> 5 years older</w:t>
+        <w:t>High school: 2006-2010. Graduated May 2010.</w:t>
       </w:r>
     </w:p>
     <w:p>
       <w:r>
-        <w:rPr>
-          <w:b/>
-        </w:rPr>
-        <w:t>Childhood:</w:t>
-      </w:r>
-      <w:r>
-        <w:t xml:space="preserve"> serious travel-baseball player; much of the family's weekends, money, hotels, and attention revolved around his games</w:t>
+        <w:t>Southwestern Illinois College: fall 2010-spring 2011; withdrew when work, money, family obligations, and exhaustion made the schedule unsustainable.</w:t>
       </w:r>
     </w:p>
     <w:p>
       <w:r>
-        <w:rPr>
-          <w:b/>
-        </w:rPr>
-        <w:t>Adult work:</w:t>
-      </w:r>
-      <w:r>
-        <w:t xml:space="preserve"> warehouse/logistics supervisor in the Metro East</w:t>
+        <w:t>Trident Technical College: began fall 2025. GPA after first full year: 3.82. Second year underway fall 2026.</w:t>
       </w:r>
     </w:p>
     <w:p>
       <w:r>
-        <w:rPr>
-          <w:b/>
-        </w:rPr>
-        <w:t>Wife:</w:t>
-      </w:r>
-      <w:r>
-        <w:t xml:space="preserve"> Melissa Grant Mercer, born July 30, 1986</w:t>
+        <w:t>Transfer goal: University of South Carolina, psychology. Longer-term goal: social work, especially community mental health, family services, and poverty-facing systems.</w:t>
       </w:r>
     </w:p>
-    <w:p>
-      <w:r>
-        <w:rPr>
-          <w:b/>
-        </w:rPr>
-        <w:t>Children:</w:t>
-      </w:r>
-      <w:r>
-        <w:t xml:space="preserve"> Tyler Mercer, born May 6, 2012; Emily Mercer, born September 17, 2015</w:t>
-      </w:r>
-    </w:p>
-    <w:p>
-      <w:r>
-        <w:rPr>
-          <w:b/>
-        </w:rPr>
-        <w:t>Character:</w:t>
-      </w:r>
-      <w:r>
-        <w:t xml:space="preserve"> competitive, basically decent, sometimes oblivious to how much family attention he received as a boy; as an adult becomes more protective of Tammy than he knows how to say</w:t>
-      </w:r>
-    </w:p>
-    <w:p/>
-    <w:p>
-      <w:r>
-        <w:t>Michael "Mike" David Mercer</w:t>
-      </w:r>
-    </w:p>
-    <w:p>
-      <w:r>
-        <w:rPr>
-          <w:b/>
-        </w:rPr>
-        <w:t>Born:</w:t>
-      </w:r>
-      <w:r>
-        <w:t xml:space="preserve"> August 24, 1987</w:t>
-      </w:r>
-    </w:p>
-    <w:p>
-      <w:r>
-        <w:rPr>
-          <w:b/>
-        </w:rPr>
-        <w:t>Relationship to Tammy:</w:t>
-      </w:r>
-      <w:r>
-        <w:t xml:space="preserve"> 3 years older</w:t>
-      </w:r>
-    </w:p>
-    <w:p>
-      <w:r>
-        <w:rPr>
-          <w:b/>
-        </w:rPr>
-        <w:t>Childhood:</w:t>
-      </w:r>
-      <w:r>
-        <w:t xml:space="preserve"> travel baseball too; funnier and less driven than Jason, frequently the sibling who could make Tammy laugh when she was furious</w:t>
-      </w:r>
-    </w:p>
-    <w:p>
-      <w:r>
-        <w:rPr>
-          <w:b/>
-        </w:rPr>
-        <w:t>Adult work:</w:t>
-      </w:r>
-      <w:r>
-        <w:t xml:space="preserve"> HVAC service technician</w:t>
-      </w:r>
-    </w:p>
-    <w:p>
-      <w:r>
-        <w:rPr>
-          <w:b/>
-        </w:rPr>
-        <w:t>Wife:</w:t>
-      </w:r>
-      <w:r>
-        <w:t xml:space="preserve"> Kendra Walsh Mercer, born December 3, 1988</w:t>
-      </w:r>
-    </w:p>
-    <w:p>
-      <w:r>
-        <w:rPr>
-          <w:b/>
-        </w:rPr>
-        <w:t>Children:</w:t>
-      </w:r>
-      <w:r>
-        <w:t xml:space="preserve"> Sophie Mercer, born February 22, 2016; Luke Mercer, born November 1, 2019</w:t>
-      </w:r>
-    </w:p>
-    <w:p>
-      <w:r>
-        <w:rPr>
-          <w:b/>
-        </w:rPr>
-        <w:t>Character:</w:t>
-      </w:r>
-      <w:r>
-        <w:t xml:space="preserve"> teasing, mechanically competent, impulsive when young, warm-hearted underneath</w:t>
-      </w:r>
-    </w:p>
-    <w:p/>
     <w:p>
       <w:pPr>
         <w:pStyle w:val="Heading1"/>
       </w:pPr>
       <w:r>
-        <w:t>GRANDPARENTS</w:t>
+        <w:t>WORK</w:t>
       </w:r>
     </w:p>
     <w:p>
       <w:r>
-        <w:rPr>
-          <w:b/>
-        </w:rPr>
-        <w:t>Paternal grandfather:</w:t>
-      </w:r>
-      <w:r>
-        <w:t xml:space="preserve"> Walter James Mercer</w:t>
+        <w:t>Longtime job: Riverview Route 3 Diner in the Metro East, first part-time and later full-time.</w:t>
       </w:r>
     </w:p>
     <w:p>
       <w:r>
-        <w:rPr>
-          <w:b/>
-        </w:rPr>
-        <w:t>Born:</w:t>
-      </w:r>
-      <w:r>
-        <w:t xml:space="preserve"> January 27, 1935</w:t>
+        <w:t>Current employer: Hyatt Regency Charleston.</w:t>
       </w:r>
     </w:p>
     <w:p>
       <w:r>
-        <w:rPr>
-          <w:b/>
-        </w:rPr>
-        <w:t>Died:</w:t>
-      </w:r>
-      <w:r>
-        <w:t xml:space="preserve"> August 3, 2014</w:t>
+        <w:t>Current role: evening/night front-desk agent.</w:t>
       </w:r>
     </w:p>
     <w:p>
       <w:r>
-        <w:rPr>
-          <w:b/>
-        </w:rPr>
-        <w:t>Work:</w:t>
-      </w:r>
-      <w:r>
-        <w:t xml:space="preserve"> machinist / plant maintenance</w:t>
+        <w:t>Base wage: $20.75/hour plus typical $1.25 evening/night differential.</w:t>
       </w:r>
     </w:p>
     <w:p>
       <w:r>
-        <w:rPr>
-          <w:b/>
-        </w:rPr>
-        <w:t>Character:</w:t>
-      </w:r>
-      <w:r>
-        <w:t xml:space="preserve"> practical, stern-looking, gentler with grandchildren than with his own children</w:t>
-      </w:r>
-    </w:p>
-    <w:p/>
-    <w:p>
-      <w:r>
-        <w:rPr>
-          <w:b/>
-        </w:rPr>
-        <w:t>Paternal grandmother:</w:t>
-      </w:r>
-      <w:r>
-        <w:t xml:space="preserve"> June Evelyn Mercer</w:t>
+        <w:t>Typical hours: 32-36 per week.</w:t>
       </w:r>
     </w:p>
     <w:p>
       <w:r>
-        <w:rPr>
-          <w:b/>
-        </w:rPr>
-        <w:t>Born:</w:t>
-      </w:r>
-      <w:r>
-        <w:t xml:space="preserve"> June 12, 1937</w:t>
+        <w:t>Projected 2026 gross employment income: about $39,500 before taxes.</w:t>
       </w:r>
     </w:p>
-    <w:p>
-      <w:r>
-        <w:rPr>
-          <w:b/>
-        </w:rPr>
-        <w:t>Status:</w:t>
-      </w:r>
-      <w:r>
-        <w:t xml:space="preserve"> alive in 2026</w:t>
-      </w:r>
-    </w:p>
-    <w:p>
-      <w:r>
-        <w:rPr>
-          <w:b/>
-        </w:rPr>
-        <w:t>Character:</w:t>
-      </w:r>
-      <w:r>
-        <w:t xml:space="preserve"> saves foil, jars, rubber bands, gift bags, and containers; expresses affection through food and objects she thinks somebody can use</w:t>
-      </w:r>
-    </w:p>
-    <w:p/>
-    <w:p>
-      <w:r>
-        <w:rPr>
-          <w:b/>
-        </w:rPr>
-        <w:t>Maternal grandfather:</w:t>
-      </w:r>
-      <w:r>
-        <w:t xml:space="preserve"> Harold Bennett</w:t>
-      </w:r>
-    </w:p>
-    <w:p>
-      <w:r>
-        <w:rPr>
-          <w:b/>
-        </w:rPr>
-        <w:t>Born:</w:t>
-      </w:r>
-      <w:r>
-        <w:t xml:space="preserve"> February 5, 1938</w:t>
-      </w:r>
-    </w:p>
-    <w:p>
-      <w:r>
-        <w:rPr>
-          <w:b/>
-        </w:rPr>
-        <w:t>Died:</w:t>
-      </w:r>
-      <w:r>
-        <w:t xml:space="preserve"> November 19, 2020</w:t>
-      </w:r>
-    </w:p>
-    <w:p>
-      <w:r>
-        <w:rPr>
-          <w:b/>
-        </w:rPr>
-        <w:t>Work:</w:t>
-      </w:r>
-      <w:r>
-        <w:t xml:space="preserve"> truck mechanic, later parts-counter work</w:t>
-      </w:r>
-    </w:p>
-    <w:p>
-      <w:r>
-        <w:rPr>
-          <w:b/>
-        </w:rPr>
-        <w:t>Character:</w:t>
-      </w:r>
-      <w:r>
-        <w:t xml:space="preserve"> talkative, opinionated, liked explaining machines to anybody who would listen</w:t>
-      </w:r>
-    </w:p>
-    <w:p/>
-    <w:p>
-      <w:r>
-        <w:rPr>
-          <w:b/>
-        </w:rPr>
-        <w:t>Maternal grandmother:</w:t>
-      </w:r>
-      <w:r>
-        <w:t xml:space="preserve"> Ruth Elaine Bennett</w:t>
-      </w:r>
-    </w:p>
-    <w:p>
-      <w:r>
-        <w:rPr>
-          <w:b/>
-        </w:rPr>
-        <w:t>Born:</w:t>
-      </w:r>
-      <w:r>
-        <w:t xml:space="preserve"> October 21, 1940</w:t>
-      </w:r>
-    </w:p>
-    <w:p>
-      <w:r>
-        <w:rPr>
-          <w:b/>
-        </w:rPr>
-        <w:t>Status:</w:t>
-      </w:r>
-      <w:r>
-        <w:t xml:space="preserve"> alive in 2026</w:t>
-      </w:r>
-    </w:p>
-    <w:p>
-      <w:r>
-        <w:rPr>
-          <w:b/>
-        </w:rPr>
-        <w:t>Character:</w:t>
-      </w:r>
-      <w:r>
-        <w:t xml:space="preserve"> calmer than Harold, quietly religious, the person who can settle a family gathering by changing the subject without anyone noticing</w:t>
-      </w:r>
-    </w:p>
-    <w:p/>
     <w:p>
       <w:pPr>
         <w:pStyle w:val="Heading1"/>
       </w:pPr>
       <w:r>
-        <w:t>COUSINS</w:t>
+        <w:t>HOME AND PROPERTY</w:t>
       </w:r>
     </w:p>
     <w:p>
       <w:r>
-        <w:t>Kelly Bennett — born August 14, 1989; one year older than Tammy; socially confident, sometimes protective</w:t>
+        <w:t>Boat: 1980 Chris-Craft 35 cabin cruiser. Purchased October 3, 2025 from Frank Mallory for $25,000. Down payment $5,000. Owner-financed balance $20,000 at 0% interest, paid at $400/month for 50 months. First payment November 1, 2025. Twelve payments made through October 1, 2026; approximate remaining principal October 20, 2026: $15,200.</w:t>
       </w:r>
     </w:p>
     <w:p>
       <w:r>
-        <w:t>Derek Bennett — born January 30, 1992; Kelly's younger brother; gravitated toward Jason and Mike</w:t>
+        <w:t>Condition: starboard gasoline inboard runs; port engine remains a major diagnosis/rebuild project. Tammy handles maintenance within her competence and hires specialized help where needed.</w:t>
       </w:r>
     </w:p>
     <w:p>
       <w:r>
-        <w:t>April Mercer — born April 19, 1990; paternal cousin close to Tammy's age; clothes, gossip, secrets, and periodic jealousy during adolescence</w:t>
+        <w:t>Slip: D-2, St. Johns Yacht Harbor. Slip payment about $428/month. Association/marina dues about $295/month. Electric budget $150/month. Property-tax reserve $75/month.</w:t>
       </w:r>
     </w:p>
-    <w:p/>
     <w:p>
       <w:pPr>
         <w:pStyle w:val="Heading1"/>
       </w:pPr>
       <w:r>
-        <w:t>CHILDHOOD / SCHOOL CONTINUITY</w:t>
+        <w:t>VEHICLE</w:t>
       </w:r>
     </w:p>
     <w:p>
       <w:r>
-        <w:rPr>
-          <w:b/>
-        </w:rPr>
-        <w:t>Kindergarten:</w:t>
-      </w:r>
-      <w:r>
-        <w:t xml:space="preserve"> fall 1996-spring 1997</w:t>
+        <w:t>1970 Plymouth Barracuda, 318 V8, automatic. Ray’s long-term car and the machine Tammy learned mechanics on. Ray transferred title to Tammy in spring 2024. The old 8-track deck still works, and a Heart 8-track stays in the car.</w:t>
       </w:r>
     </w:p>
-    <w:p>
-      <w:r>
-        <w:rPr>
-          <w:b/>
-        </w:rPr>
-        <w:t>First grade:</w:t>
-      </w:r>
-      <w:r>
-        <w:t xml:space="preserve"> 1997-1998</w:t>
-      </w:r>
-    </w:p>
-    <w:p>
-      <w:r>
-        <w:rPr>
-          <w:b/>
-        </w:rPr>
-        <w:t>Second grade:</w:t>
-      </w:r>
-      <w:r>
-        <w:t xml:space="preserve"> 1998-1999</w:t>
-      </w:r>
-    </w:p>
-    <w:p>
-      <w:r>
-        <w:rPr>
-          <w:b/>
-        </w:rPr>
-        <w:t>First third-grade year:</w:t>
-      </w:r>
-      <w:r>
-        <w:t xml:space="preserve"> 1999-2000</w:t>
-      </w:r>
-    </w:p>
-    <w:p>
-      <w:r>
-        <w:rPr>
-          <w:b/>
-        </w:rPr>
-        <w:t>February 7, 2000:</w:t>
-      </w:r>
-      <w:r>
-        <w:t xml:space="preserve"> Tammy intervenes when an older fifth-grade girl, Tasha, is assaulting/roughing up Tammy's classmate Renee Carter. Tasha shoves and hits Tammy; Tammy fights back, gets on top of her, and keeps hitting after Tasha is down. Tasha's nose is bloodied. Tammy is expelled because of the severity of the fight and the fact that she continued after the immediate threat ended.</w:t>
-      </w:r>
-    </w:p>
-    <w:p>
-      <w:r>
-        <w:rPr>
-          <w:b/>
-        </w:rPr>
-        <w:t>Consequence:</w:t>
-      </w:r>
-      <w:r>
-        <w:t xml:space="preserve"> Tammy loses the school year administratively and repeats third grade. She is NOT held back for academic weakness; she is a strong reader and high-performing student.</w:t>
-      </w:r>
-    </w:p>
-    <w:p>
-      <w:r>
-        <w:rPr>
-          <w:b/>
-        </w:rPr>
-        <w:t>Second third-grade year:</w:t>
-      </w:r>
-      <w:r>
-        <w:t xml:space="preserve"> 2000-2001 at a different elementary placement</w:t>
-      </w:r>
-    </w:p>
-    <w:p>
-      <w:r>
-        <w:rPr>
-          <w:b/>
-        </w:rPr>
-        <w:t>Fourth grade:</w:t>
-      </w:r>
-      <w:r>
-        <w:t xml:space="preserve"> 2001-2002</w:t>
-      </w:r>
-    </w:p>
-    <w:p>
-      <w:r>
-        <w:rPr>
-          <w:b/>
-        </w:rPr>
-        <w:t>Fifth grade:</w:t>
-      </w:r>
-      <w:r>
-        <w:t xml:space="preserve"> 2002-2003</w:t>
-      </w:r>
-    </w:p>
-    <w:p>
-      <w:r>
-        <w:rPr>
-          <w:b/>
-        </w:rPr>
-        <w:t>Middle school:</w:t>
-      </w:r>
-      <w:r>
-        <w:t xml:space="preserve"> 2003-2006</w:t>
-      </w:r>
-    </w:p>
-    <w:p>
-      <w:r>
-        <w:rPr>
-          <w:b/>
-        </w:rPr>
-        <w:t>High school:</w:t>
-      </w:r>
-      <w:r>
-        <w:t xml:space="preserve"> 2006-2010</w:t>
-      </w:r>
-    </w:p>
-    <w:p>
-      <w:r>
-        <w:rPr>
-          <w:b/>
-        </w:rPr>
-        <w:t>Graduation:</w:t>
-      </w:r>
-      <w:r>
-        <w:t xml:space="preserve"> May 2010</w:t>
-      </w:r>
-    </w:p>
-    <w:p/>
-    <w:p>
-      <w:r>
-        <w:rPr>
-          <w:b/>
-        </w:rPr>
-        <w:t>The expulsion becomes a formative wound. Ray tells her:</w:t>
-      </w:r>
-      <w:r>
-        <w:t xml:space="preserve"> "Defending somebody and losing control are two different things. Don't mix them together just because they happened in the same minute." Tammy remembers the distinction for life.</w:t>
-      </w:r>
-    </w:p>
-    <w:p/>
     <w:p>
       <w:pPr>
         <w:pStyle w:val="Heading1"/>
       </w:pPr>
       <w:r>
-        <w:t>EARLY PUBERTY / BODY HISTORY</w:t>
+        <w:t>IMPORTANT PEOPLE</w:t>
       </w:r>
     </w:p>
     <w:p>
       <w:r>
-        <w:t>Tammy is already somewhat heavy as a child. Puberty begins early enough that by middle school she has developed breasts before many of her classmates. Being older because of the repeated grade makes the difference even more visible. She is mocked both for weight and for developing early.</w:t>
+        <w:t>Shannon Price, born December 15, 1990: oldest close friend.</w:t>
       </w:r>
     </w:p>
     <w:p>
       <w:r>
-        <w:rPr>
-          <w:b/>
-        </w:rPr>
-        <w:t>First period:</w:t>
-      </w:r>
-      <w:r>
-        <w:t xml:space="preserve"> August 2003, shortly before sixth grade</w:t>
+        <w:t>Erica Dawson, born February 11, 1991: cheer friend.</w:t>
       </w:r>
     </w:p>
     <w:p>
       <w:r>
-        <w:rPr>
-          <w:b/>
-        </w:rPr>
-        <w:t>Middle-school emotional pattern:</w:t>
-      </w:r>
-      <w:r>
-        <w:t xml:space="preserve"> wants desperately to disappear when people look at her body, yet aches to be noticed for her mind and personality</w:t>
+        <w:t>Monique Harris, born May 27, 1990: smart, funny high-school friend.</w:t>
       </w:r>
     </w:p>
     <w:p>
       <w:r>
-        <w:rPr>
-          <w:b/>
-        </w:rPr>
-        <w:t>Freshman year:</w:t>
-      </w:r>
-      <w:r>
-        <w:t xml:space="preserve"> still heavy and socially insecure</w:t>
+        <w:t>Lisa Carver, born January 9, 1972: diner coworker and mentor.</w:t>
       </w:r>
     </w:p>
     <w:p>
       <w:r>
-        <w:rPr>
-          <w:b/>
-        </w:rPr>
-        <w:t>Sophomore year (2007-2008):</w:t>
-      </w:r>
-      <w:r>
-        <w:t xml:space="preserve"> loses substantial weight through cheer conditioning, walking, and changing eating habits; makes cheer team</w:t>
+        <w:t>Marisol Vega, born July 16, 1994: hotel coworker and friend.</w:t>
       </w:r>
     </w:p>
     <w:p>
       <w:r>
-        <w:rPr>
-          <w:b/>
-        </w:rPr>
-        <w:t>After weight loss:</w:t>
-      </w:r>
-      <w:r>
-        <w:t xml:space="preserve"> boys who mocked her weight begin sexualizing her; "Jugs" becomes a humiliating nickname because of her chest</w:t>
+        <w:t>Eli Patterson, born March 3, 1958: marina neighbor and trusted mechanical sounding board.</w:t>
       </w:r>
     </w:p>
     <w:p>
       <w:r>
-        <w:rPr>
-          <w:b/>
-        </w:rPr>
-        <w:t>Core wound:</w:t>
-      </w:r>
-      <w:r>
-        <w:t xml:space="preserve"> "Please see me / please don't reduce me."</w:t>
+        <w:t>Professor Nina Patel, born September 25, 1978: psychology instructor.</w:t>
       </w:r>
     </w:p>
-    <w:p/>
+    <w:p>
+      <w:r>
+        <w:t>Daniel “Danny” Cole, born February 17, 1990: Tammy’s first defining love. One grade ahead because Tammy repeated third grade. Texas Tech football scholarship. Relationship gradually faded after he left for college. He later married Amanda Reeves.</w:t>
+      </w:r>
+    </w:p>
     <w:p>
       <w:pPr>
         <w:pStyle w:val="Heading1"/>
       </w:pPr>
       <w:r>
-        <w:t>THIRD-GRADE FIGHT PEOPLE</w:t>
+        <w:t>CURRENT ACADEMIC AND RESIDENCY PLAN</w:t>
       </w:r>
     </w:p>
     <w:p>
       <w:r>
-        <w:rPr>
-          <w:b/>
-        </w:rPr>
-        <w:t>Renee Carter:</w:t>
-      </w:r>
-      <w:r>
-        <w:t xml:space="preserve"> quiet third-grade classmate Tammy defended; family under stress, coat often smelled of cigarette smoke from adults at home; Renee did not ask Tammy to fight for her</w:t>
+        <w:t>Moved to South Carolina June 30, 2025. South Carolina driver's license and Barracuda registration completed July 2025. Files South Carolina taxes and supports herself. She keeps a residency folder with license, registration, tax, bank, employment, and residence records for USC's residency determination. She expects to have more than twelve continuous months of South Carolina domicile by transfer but understands resident tuition requires approval, not simply the passage of time.</w:t>
       </w:r>
     </w:p>
-    <w:p>
-      <w:r>
-        <w:rPr>
-          <w:b/>
-        </w:rPr>
-        <w:t>Tasha:</w:t>
-      </w:r>
-      <w:r>
-        <w:t xml:space="preserve"> fifth-grade girl involved in gang-adjacent family/social conflict; Tammy's diary should not turn Tasha into a cartoon villain. Tasha was an older child in a rough environment, not a symbol of East St. Louis.</w:t>
-      </w:r>
-    </w:p>
-    <w:p/>
     <w:p>
       <w:pPr>
         <w:pStyle w:val="Heading1"/>
       </w:pPr>
       <w:r>
-        <w:t>FRIENDS / RECURRING CAST</w:t>
+        <w:t>TAMMY LYNN MERCER — PERSONAL FACTS, CONTACTS, PLACES, AND DATES</w:t>
       </w:r>
     </w:p>
     <w:p>
       <w:r>
-        <w:t>Shannon Price — born December 15, 1990. Tammy's closest grade-school friend and one of the few people who treats Tammy the same before and after her body changes.</w:t>
+        <w:t>Updated October 20, 2026</w:t>
       </w:r>
     </w:p>
     <w:p>
       <w:r>
-        <w:t>Erica Dawson — born February 11, 1991. Cheer-team friend; popular, socially fluent, genuinely kind.</w:t>
+        <w:t>Full legal name: Tammy Lynn Mercer</w:t>
       </w:r>
     </w:p>
     <w:p>
       <w:r>
-        <w:t>Monique Harris — born May 27, 1990. Smart, funny classmate who refuses to make herself smaller for anyone; Tammy admires that.</w:t>
+        <w:t>Born: November 6, 1990, Belleville, Illinois</w:t>
       </w:r>
     </w:p>
     <w:p>
       <w:r>
-        <w:t>Lisa Carver — born January 9, 1972. Older diner coworker and mentor; practical, funny, excellent at reading customers and defusing trouble.</w:t>
+        <w:t>Current age: 35</w:t>
       </w:r>
     </w:p>
     <w:p>
       <w:r>
-        <w:t>Marisol Vega — born July 16, 1994. Charleston hotel coworker; funny, direct, dependable; calls Tammy "Professor."</w:t>
+        <w:t>Current cell: 843-555-0147</w:t>
       </w:r>
     </w:p>
     <w:p>
       <w:r>
-        <w:t>Eli Patterson — born March 3, 1958. Older marina neighbor; respects Tammy's mechanical ability and loans tools without taking over.</w:t>
+        <w:t>Current email: tammy.mercer90@example.com</w:t>
       </w:r>
     </w:p>
     <w:p>
       <w:r>
-        <w:t>Professor Nina Patel — born September 25, 1978. Psychology instructor who recognizes Tammy's intelligence and seriousness.</w:t>
+        <w:t>Current mailing address: Tammy Mercer, Slip D-2, St. Johns Yacht Harbor, 2408 Maybank Hwy, Johns Island, SC 29455</w:t>
       </w:r>
     </w:p>
     <w:p>
       <w:r>
-        <w:t>Mrs. Keene — older diner regular whose struggles with housing/benefits/medical bureaucracy help awaken Tammy's interest in social work.</w:t>
+        <w:t>Mother: Deborah “Debbie” Bennett Mercer, born September 2, 1964. Cell 618-555-0116. Trailer landline 618-555-0138. Email debbie.mercer64@example.com. Address: Lot 38, River Bend Mobile Home Park, south St. Clair County, Illinois.</w:t>
       </w:r>
     </w:p>
     <w:p>
       <w:r>
-        <w:t>Frank Mallory — previous owner of Tammy's Chris-Craft; owner-finances sale because he wants out of slip fees and deferred maintenance.</w:t>
+        <w:t>Father: Raymond “Ray” Mercer, born March 18, 1962, died July 19, 2024. Old cell retained in contacts: 618-555-0118. Buried Walnut Hill Cemetery, 1101 Mascoutah Ave., Belleville, IL 62220, Section 15, Lot 248, Grave 3.</w:t>
       </w:r>
     </w:p>
-    <w:p/>
+    <w:p>
+      <w:r>
+        <w:t>Jason Raymond Mercer: born April 11, 1985. Melissa Grant Mercer: born July 30, 1986. Tyler Mercer: born May 6, 2012. Emily Mercer: born September 17, 2015.</w:t>
+      </w:r>
+    </w:p>
+    <w:p>
+      <w:r>
+        <w:t>Michael “Mike” David Mercer: born August 24, 1987. Kendra Walsh Mercer: born December 3, 1988. Sophie Mercer: born February 22, 2016. Luke Mercer: born November 1, 2019.</w:t>
+      </w:r>
+    </w:p>
+    <w:p>
+      <w:r>
+        <w:t>Walter James Mercer: January 27, 1935-August 3, 2014.</w:t>
+      </w:r>
+    </w:p>
+    <w:p>
+      <w:r>
+        <w:t>June Evelyn Mercer: born June 12, 1937.</w:t>
+      </w:r>
+    </w:p>
+    <w:p>
+      <w:r>
+        <w:t>Harold Bennett: February 5, 1938-November 19, 2020.</w:t>
+      </w:r>
+    </w:p>
+    <w:p>
+      <w:r>
+        <w:t>Ruth Elaine Bennett: born October 21, 1940.</w:t>
+      </w:r>
+    </w:p>
+    <w:p>
+      <w:r>
+        <w:t>Kelly Bennett: born August 14, 1989. Derek Bennett: born January 30, 1992. April Mercer: born April 19, 1990.</w:t>
+      </w:r>
+    </w:p>
+    <w:p>
+      <w:r>
+        <w:t>Shannon Price: born December 15, 1990.</w:t>
+      </w:r>
+    </w:p>
+    <w:p>
+      <w:r>
+        <w:t>Erica Dawson: born February 11, 1991.</w:t>
+      </w:r>
+    </w:p>
+    <w:p>
+      <w:r>
+        <w:t>Monique Harris: born May 27, 1990.</w:t>
+      </w:r>
+    </w:p>
+    <w:p>
+      <w:r>
+        <w:t>Lisa Carver: born January 9, 1972.</w:t>
+      </w:r>
+    </w:p>
+    <w:p>
+      <w:r>
+        <w:t>Marisol Vega: born July 16, 1994.</w:t>
+      </w:r>
+    </w:p>
+    <w:p>
+      <w:r>
+        <w:t>Eli Patterson: born March 3, 1958.</w:t>
+      </w:r>
+    </w:p>
+    <w:p>
+      <w:r>
+        <w:t>Professor Nina Patel: born September 25, 1978.</w:t>
+      </w:r>
+    </w:p>
+    <w:p>
+      <w:r>
+        <w:t>Daniel “Danny” Cole: born February 17, 1990.</w:t>
+      </w:r>
+    </w:p>
+    <w:p>
+      <w:r>
+        <w:t>Amanda Reeves: born October 3, 1990.</w:t>
+      </w:r>
+    </w:p>
+    <w:p>
+      <w:r>
+        <w:t>Important dates: expelled after fight February 7, 2000; high-school graduation May 2010; SWIC fall 2010-spring 2011; Dad heart attack June 2015; EXIT savings account January 2022; Barracuda title transferred spring 2024; Dad died July 19, 2024; Dad buried July 24, 2024; left Illinois June 30, 2025; began Trident fall 2025; bought Chris-Craft October 3, 2025; second Trident year began fall 2026.</w:t>
+      </w:r>
+    </w:p>
+    <w:p>
+      <w:r>
+        <w:t>Vehicle: 1970 Plymouth Barracuda, 318 V8, automatic, paid off. Old Heart 8-track remains in the working 8-track deck.</w:t>
+      </w:r>
+    </w:p>
+    <w:p>
+      <w:r>
+        <w:t>Boat: 1980 Chris-Craft 35, purchase price $25,000, $5,000 down, $20,000 owner-financed at 0%, $400/month for 50 months.</w:t>
+      </w:r>
+    </w:p>
+    <w:p>
+      <w:r>
+        <w:t>Current work: Hyatt Regency Charleston, evening/night front desk, $20.75/hour plus typical $1.25 evening/night differential, 32-36 hours/week, projected 2026 gross about $39,500.</w:t>
+      </w:r>
+    </w:p>
+    <w:p>
+      <w:r>
+        <w:t>Current school: Trident Technical College, second year, first-year GPA 3.82. Transfer target USC psychology; later social work.</w:t>
+      </w:r>
+    </w:p>
     <w:p>
       <w:pPr>
         <w:pStyle w:val="Heading1"/>
       </w:pPr>
       <w:r>
-        <w:t>DANNY COLE — FIRST LOVE</w:t>
+        <w:t>TAMMY LYNN MERCER — FEELINGS, OPINIONS, TASTES, AND PRIVATE PREFERENCES</w:t>
       </w:r>
     </w:p>
     <w:p>
       <w:r>
-        <w:rPr>
-          <w:b/>
-        </w:rPr>
-        <w:t>Full name:</w:t>
-      </w:r>
-      <w:r>
-        <w:t xml:space="preserve"> Daniel "Danny" Cole</w:t>
+        <w:t>Updated October 20, 2026</w:t>
       </w:r>
     </w:p>
     <w:p>
       <w:r>
-        <w:rPr>
-          <w:b/>
-        </w:rPr>
-        <w:t>Born:</w:t>
-      </w:r>
-      <w:r>
-        <w:t xml:space="preserve"> February 17, 1990</w:t>
+        <w:t>I want to be known, not merely noticed. The contradiction I have carried for years is simple: please see me, but please do not reduce me.</w:t>
       </w:r>
     </w:p>
     <w:p>
       <w:r>
-        <w:t>Same age as Tammy, but one grade ahead because Tammy repeated third grade</w:t>
+        <w:t>I was heavy as a child and developed breasts earlier than most girls around me. Later I lost weight, made cheer, and discovered that ridicule can turn into sexual attention without becoming respect. I can enjoy feeling attractive and hate being stared at in the same hour. In my thirties I am fuller again and increasingly refuse to treat my body as a moral report card.</w:t>
       </w:r>
     </w:p>
     <w:p>
       <w:r>
-        <w:rPr>
-          <w:b/>
-        </w:rPr>
-        <w:t>High-school role:</w:t>
-      </w:r>
-      <w:r>
-        <w:t xml:space="preserve"> senior quarterback during Tammy's junior year, 2008-2009</w:t>
+        <w:t>I am curious before ideological. I like deep conversations that can change direction when somebody says something true. I dislike people who are only waiting for their turn to deliver a prepared answer. Psychology interests me because it names patterns I have spent my life noticing. I distrust theories that make human beings too neat.</w:t>
       </w:r>
     </w:p>
     <w:p>
       <w:r>
-        <w:rPr>
-          <w:b/>
-        </w:rPr>
-        <w:t>Character:</w:t>
-      </w:r>
-      <w:r>
-        <w:t xml:space="preserve"> fundamentally good young man; listens to Tammy, asks what she reads, does not treat her as stupid or as a body first</w:t>
+        <w:t>I believe circumstances matter and responsibility still exists. The third-grade fight is my earliest example: protecting Renee was right; continuing to hit Tasha after the threat changed was wrong. Two truths can occupy the same event.</w:t>
       </w:r>
     </w:p>
     <w:p>
       <w:r>
-        <w:rPr>
-          <w:b/>
-        </w:rPr>
-        <w:t>Football:</w:t>
-      </w:r>
-      <w:r>
-        <w:t xml:space="preserve"> fictional scholarship to Texas Tech; his college football history is fictional and should not be tied to a real roster or real stats</w:t>
-      </w:r>
-    </w:p>
-    <w:p/>
-    <w:p>
-      <w:r>
-        <w:rPr>
-          <w:b/>
-        </w:rPr>
-        <w:t>Relationship chronology:</w:t>
+        <w:t>I believe in God. Church of Christ language is part of me even though I question doctrine more openly now. Prayer still comes naturally when I am frightened or grieving. I reject shame as a substitute for ethics. I care about fidelity, responsibility, honesty, protecting vulnerable people, and keeping promises.</w:t>
       </w:r>
     </w:p>
     <w:p>
-      <w:pPr>
-        <w:pStyle w:val="ListBullet"/>
-      </w:pPr>
       <w:r>
-        <w:t>Tammy falls hard for Danny during high school.</w:t>
+        <w:t>I am romantic. Danny mattered because he listened to my mind when many boys were looking at my body first. I do not need to turn him into a villain to admit how badly losing the future I imagined hurt. I did not regret loving him. I regretted believing love guaranteed permanence.</w:t>
       </w:r>
     </w:p>
     <w:p>
-      <w:pPr>
-        <w:pStyle w:val="ListBullet"/>
-      </w:pPr>
       <w:r>
-        <w:t>Junior year, after Tammy turns 18, their physical relationship becomes serious. One night they go much farther than before. Tammy wants him intensely but stops before intercourse. Danny respects the stop. The event matters because Tammy learns that wanting something and choosing not to do it can both be true at once.</w:t>
+        <w:t>My sexual history with Danny belongs to my life without becoming either a badge or a stain. At eighteen I learned that wanting somebody and stopping are both real choices. At nineteen I chose intercourse with him because I loved and trusted him and believed we had a future. I can remember desire, pain, tenderness, awkwardness, religious guilt, and certainty without forcing those memories into one emotion.</w:t>
       </w:r>
     </w:p>
     <w:p>
-      <w:pPr>
-        <w:pStyle w:val="ListBullet"/>
-      </w:pPr>
       <w:r>
-        <w:t>Danny graduates in spring 2009 and leaves for Texas Tech that fall.</w:t>
+        <w:t>I like Heart more than any other band. The old Heart 8-track in the Barracuda is inseparable from Dad, the car, and the sound of my childhood. I also love The Cranberries, Pearl Jam, Matchbox Twenty, Goo Goo Dolls, Collective Soul, Alanis Morissette, Third Eye Blind, Counting Crows, Stone Temple Pilots, and Sheryl Crow. I like strong female voices and melodic rock. I am a St. Louis Blues fan.</w:t>
       </w:r>
     </w:p>
     <w:p>
-      <w:pPr>
-        <w:pStyle w:val="ListBullet"/>
-      </w:pPr>
       <w:r>
-        <w:t>Calls and handwritten letters are frequent at first, then thin gradually as college life absorbs him.</w:t>
+        <w:t>Fast food / quick meal preferences: Mexican or Chinese first. Reliable chains are Chipotle, Chick-fil-A, Panera, and Burger King. Chipotle works between class and work. Panera works when I need soup, coffee, and a table to study at. Chinese takeout is comfort food and usually becomes two meals if I am careful. Burger King feels like road-trip and late-shift food.</w:t>
       </w:r>
     </w:p>
     <w:p>
-      <w:pPr>
-        <w:pStyle w:val="ListBullet"/>
-      </w:pPr>
       <w:r>
-        <w:t>Tammy watches every game she can, tracks his number and performance, and privately imagines being the wife who knew him before fame.</w:t>
+        <w:t>I read psychology, memoir, social issues, history, and literature. Libraries were one of the first places I could belong without money or status. I write in books I own and use sticky notes in books I do not.</w:t>
       </w:r>
     </w:p>
     <w:p>
-      <w:pPr>
-        <w:pStyle w:val="ListBullet"/>
-      </w:pPr>
       <w:r>
-        <w:t>Senior prom, spring 2010: Danny returns and takes Tammy. Tammy is 19. She decides to have intercourse with him for the first time. In her private diary she treats this as a deliberate choice bound up with love, trust, religion, and her belief that Danny is her future husband.</w:t>
+        <w:t>I do not romanticize working-class hardship. I am proud of repair, thrift, competence, and people who know how to make things work. I hate advice that quietly assumes parents can cosign, unpaid internships are affordable, or everybody has a safe spare bedroom. I also reject reverse snobbery; money does not automatically make somebody shallow.</w:t>
       </w:r>
     </w:p>
     <w:p>
-      <w:pPr>
-        <w:pStyle w:val="ListBullet"/>
-      </w:pPr>
       <w:r>
-        <w:t>There is no clean betrayal afterward. Danny continues to care about her, but the relationship fades one weekend and one missed call at a time.</w:t>
+        <w:t>I want children. That desire hurts sometimes. I refuse to choose the wrong relationship simply to beat a biological clock, and I refuse to pretend time does not matter. I can love my nieces and nephews and still cry after I go home.</w:t>
       </w:r>
     </w:p>
     <w:p>
-      <w:pPr>
-        <w:pStyle w:val="ListBullet"/>
-      </w:pPr>
       <w:r>
-        <w:t>During Danny's senior college season, November 2012, Tammy watches a televised postgame moment in which Danny proposes in the end zone to his college girlfriend Amanda Reeves.</w:t>
+        <w:t>At thirty-five I have one strong community-college year behind me, a 3.82 GPA, a real USC goal, a hotel job I am good at, an old boat that needs work, Dad's Barracuda, and a life that increasingly belongs to me. Being useful is not the same thing as being fully alive.</w:t>
       </w:r>
     </w:p>
-    <w:p>
-      <w:pPr>
-        <w:pStyle w:val="ListBullet"/>
-      </w:pPr>
-      <w:r>
-        <w:t>Amanda Reeves: born October 3, 1990; not a villain and never knowingly wrongs Tammy.</w:t>
-      </w:r>
-    </w:p>
-    <w:p>
-      <w:pPr>
-        <w:pStyle w:val="ListBullet"/>
-      </w:pPr>
-      <w:r>
-        <w:t>Tammy's central realization: "I didn't regret loving him. I regretted believing love guaranteed permanence."</w:t>
-      </w:r>
-    </w:p>
-    <w:p>
-      <w:pPr>
-        <w:pStyle w:val="ListBullet"/>
-      </w:pPr>
-      <w:r>
-        <w:t>No later relationship becomes major canon. Tammy may date occasionally, feel attraction, or have brief non-serious encounters, but Danny remains her only defining romantic relationship before the present-day story.</w:t>
-      </w:r>
-    </w:p>
-    <w:p/>
     <w:p>
       <w:pPr>
         <w:pStyle w:val="Heading1"/>
       </w:pPr>
       <w:r>
-        <w:t>EDUCATION / WORK TIMELINE</w:t>
+        <w:t>TAMMY LYNN MERCER — FINANCES, PROPERTY, BILLS, WORK, AND SCHOOL MONEY</w:t>
       </w:r>
     </w:p>
     <w:p>
       <w:r>
-        <w:rPr>
-          <w:b/>
-        </w:rPr>
-        <w:t>High-school graduation:</w:t>
-      </w:r>
-      <w:r>
-        <w:t xml:space="preserve"> May 2010</w:t>
+        <w:t>Updated October 20, 2026</w:t>
       </w:r>
     </w:p>
-    <w:p>
-      <w:r>
-        <w:rPr>
-          <w:b/>
-        </w:rPr>
-        <w:t>Southwestern Illinois College (SWIC):</w:t>
-      </w:r>
-      <w:r>
-        <w:t xml:space="preserve"> begins fall 2010 while working; attempts general education / transfer coursework</w:t>
-      </w:r>
-    </w:p>
-    <w:p>
-      <w:r>
-        <w:rPr>
-          <w:b/>
-        </w:rPr>
-        <w:t>Leaves/withdraws:</w:t>
-      </w:r>
-      <w:r>
-        <w:t xml:space="preserve"> spring 2011 because money, work, family obligations, and exhaustion make continuation unsustainable</w:t>
-      </w:r>
-    </w:p>
-    <w:p>
-      <w:r>
-        <w:rPr>
-          <w:b/>
-        </w:rPr>
-        <w:t>Diner:</w:t>
-      </w:r>
-      <w:r>
-        <w:t xml:space="preserve"> Riverview Route 3 Diner (fictional), Metro East; part-time from late high school, full-time after leaving SWIC; remains there for years</w:t>
-      </w:r>
-    </w:p>
-    <w:p>
-      <w:r>
-        <w:rPr>
-          <w:b/>
-        </w:rPr>
-        <w:t>Diner strengths:</w:t>
-      </w:r>
-      <w:r>
-        <w:t xml:space="preserve"> remembers regulars, listens without condescension, de-escalates drunks and angry customers, notices who is short on money, reads people well</w:t>
-      </w:r>
-    </w:p>
-    <w:p>
-      <w:r>
-        <w:rPr>
-          <w:b/>
-        </w:rPr>
-        <w:t>Intellectual life:</w:t>
-      </w:r>
-      <w:r>
-        <w:t xml:space="preserve"> continues reading psychology, trauma, history, literature, poverty, family systems, and social policy on her own</w:t>
-      </w:r>
-    </w:p>
-    <w:p/>
-    <w:p>
-      <w:r>
-        <w:t>RAY'S ILLNESS / CANCELLED CRUISE</w:t>
-      </w:r>
-    </w:p>
-    <w:p>
-      <w:r>
-        <w:rPr>
-          <w:b/>
-        </w:rPr>
-        <w:t>Tammy spends years saving for her first real vacation:</w:t>
-      </w:r>
-      <w:r>
-        <w:t xml:space="preserve"> a seven-night Caribbean cruise planned for summer 2015.</w:t>
-      </w:r>
-    </w:p>
-    <w:p>
-      <w:r>
-        <w:rPr>
-          <w:b/>
-        </w:rPr>
-        <w:t>June 2015:</w:t>
-      </w:r>
-      <w:r>
-        <w:t xml:space="preserve"> Ray suffers a heart attack shortly before the trip.</w:t>
-      </w:r>
-    </w:p>
-    <w:p>
-      <w:r>
-        <w:t>Tammy cancels the cruise and uses much of the money for household expenses, prescriptions, travel, food, and lost-income gaps.</w:t>
-      </w:r>
-    </w:p>
-    <w:p>
-      <w:r>
-        <w:t>Follow-up testing identifies occupational lung and cardiovascular damage. Doctors tell Ray he cannot safely return to welding.</w:t>
-      </w:r>
-    </w:p>
-    <w:p>
-      <w:r>
-        <w:t>Tammy becomes the nearby unmarried child who is assumed to be available. She manages forms, disability paperwork, insurance calls, medication lists, transportation, and practical crises.</w:t>
-      </w:r>
-    </w:p>
-    <w:p>
-      <w:r>
-        <w:t>She loves her parents and also resents, at times, how automatically her life becomes the flexible one. Both feelings are canon.</w:t>
-      </w:r>
-    </w:p>
-    <w:p/>
     <w:p>
       <w:pPr>
         <w:pStyle w:val="Heading1"/>
       </w:pPr>
       <w:r>
-        <w:t>ADULT BODY / AGING / MOTHERHOOD</w:t>
+        <w:t>INCOME</w:t>
       </w:r>
     </w:p>
     <w:p>
       <w:r>
-        <w:t>Through her late twenties and early thirties Tammy notices male attention diminishing compared with her teens and twenties.</w:t>
+        <w:t>Hyatt Regency Charleston front desk, evening/night shift.</w:t>
       </w:r>
     </w:p>
     <w:p>
       <w:r>
-        <w:t>Her first reaction is relief; her second, more embarrassing reaction, is grief because attention had become entangled with proof that she was visible.</w:t>
+        <w:t>Base wage: $20.75/hour.</w:t>
       </w:r>
     </w:p>
     <w:p>
       <w:r>
-        <w:t>Her weight rises somewhat under stress and age. She refuses eventually to treat this as moral failure.</w:t>
+        <w:t>Typical evening/night differential: $1.25/hour.</w:t>
       </w:r>
     </w:p>
     <w:p>
       <w:r>
-        <w:t>She wants children and feels the biological-clock question sharply in her early thirties. She loves her nieces and nephews and can feel joy for her brothers and grief for herself simultaneously.</w:t>
+        <w:t>Typical paid hours: 32-36/week.</w:t>
       </w:r>
     </w:p>
     <w:p>
       <w:r>
-        <w:t>Around her 31st birthday in November 2021 she does the arithmetic about school, career, partnership, children, and time.</w:t>
+        <w:t>Projected 2026 gross wages: about $39,500 before tax, excluding rare overtime.</w:t>
       </w:r>
     </w:p>
-    <w:p>
-      <w:r>
-        <w:rPr>
-          <w:b/>
-        </w:rPr>
-        <w:t>Key realization:</w:t>
-      </w:r>
-      <w:r>
-        <w:t xml:space="preserve"> being desired is not the same as being known.</w:t>
-      </w:r>
-    </w:p>
-    <w:p/>
     <w:p>
       <w:pPr>
         <w:pStyle w:val="Heading1"/>
       </w:pPr>
       <w:r>
-        <w:t>SOCIAL-WORK AWAKENING</w:t>
+        <w:t>EDUCATION</w:t>
       </w:r>
     </w:p>
     <w:p>
       <w:r>
-        <w:t>Around 2019 Tammy watches a social worker help Mrs. Keene navigate housing, benefits, and medical systems without humiliating her.</w:t>
+        <w:t>Trident Technical College, second year. GPA after first full year: 3.82.</w:t>
       </w:r>
     </w:p>
     <w:p>
       <w:r>
-        <w:t>Tammy recognizes that much of what she already does is adjacent to social work: listening, translating systems, noticing what people do not say, and treating embarrassment as something to protect rather than exploit.</w:t>
+        <w:t>Transfer target: University of South Carolina, psychology.</w:t>
       </w:r>
     </w:p>
     <w:p>
       <w:r>
-        <w:t>COVID-era diner work reinforces how quickly ordinary people can become vulnerable.</w:t>
+        <w:t>Tammy uses ordinary adult-student grants/aid where eligible and pays remaining tuition, books, and fees from work and savings. She avoids revolving debt where possible.</w:t>
       </w:r>
     </w:p>
-    <w:p>
-      <w:r>
-        <w:rPr>
-          <w:b/>
-        </w:rPr>
-        <w:t>January 2022:</w:t>
-      </w:r>
-      <w:r>
-        <w:t xml:space="preserve"> Tammy opens a separate savings account nicknamed EXIT.</w:t>
-      </w:r>
-    </w:p>
-    <w:p>
-      <w:r>
-        <w:t>Ray eventually tells her that she has already given the family years and that they should not get to keep needing her forever.</w:t>
-      </w:r>
-    </w:p>
-    <w:p/>
     <w:p>
       <w:pPr>
         <w:pStyle w:val="Heading1"/>
       </w:pPr>
       <w:r>
-        <w:t>MOVE TO CHARLESTON</w:t>
+        <w:t>BOAT</w:t>
       </w:r>
     </w:p>
     <w:p>
       <w:r>
-        <w:rPr>
-          <w:b/>
-        </w:rPr>
-        <w:t>Departure:</w:t>
-      </w:r>
-      <w:r>
-        <w:t xml:space="preserve"> June 30, 2025</w:t>
+        <w:t>1980 Chris-Craft 35.</w:t>
       </w:r>
     </w:p>
     <w:p>
       <w:r>
-        <w:rPr>
-          <w:b/>
-        </w:rPr>
-        <w:t>Age:</w:t>
-      </w:r>
-      <w:r>
-        <w:t xml:space="preserve"> 34</w:t>
+        <w:t>Purchased October 3, 2025 from Frank Mallory for $25,000.</w:t>
       </w:r>
     </w:p>
     <w:p>
       <w:r>
-        <w:rPr>
-          <w:b/>
-        </w:rPr>
-        <w:t>Vehicle:</w:t>
-      </w:r>
-      <w:r>
-        <w:t xml:space="preserve"> Ray's old Plymouth Barracuda. During his last good spring in 2024, Ray signs the title over to Tammy, hands her the keys, and tells her the car is hers whether she stays or goes. After Ray's death in July 2024, the Barracuda becomes both inheritance and unfinished conversation. Tammy finally drives it to Charleston when she leaves June 30, 2025.</w:t>
+        <w:t>Down payment: $5,000.</w:t>
       </w:r>
     </w:p>
     <w:p>
       <w:r>
-        <w:rPr>
-          <w:b/>
-        </w:rPr>
-        <w:t>Road-trip emotional tone:</w:t>
-      </w:r>
-      <w:r>
-        <w:t xml:space="preserve"> grief, terror, exhilaration, Heart playing through the old 8-track, tools and books in the car</w:t>
+        <w:t>Owner-financed balance at purchase: $20,000.</w:t>
       </w:r>
     </w:p>
     <w:p>
       <w:r>
-        <w:rPr>
-          <w:b/>
-        </w:rPr>
-        <w:t>Destination:</w:t>
-      </w:r>
-      <w:r>
-        <w:t xml:space="preserve"> Charleston, South Carolina</w:t>
+        <w:t>Interest: 0%.</w:t>
       </w:r>
     </w:p>
     <w:p>
       <w:r>
-        <w:rPr>
-          <w:b/>
-        </w:rPr>
-        <w:t>Reason:</w:t>
-      </w:r>
-      <w:r>
-        <w:t xml:space="preserve"> chosen future, school, distance enough to become her own adult without cutting off family</w:t>
+        <w:t>Payment: $400/month for 50 months.</w:t>
       </w:r>
     </w:p>
-    <w:p/>
+    <w:p>
+      <w:r>
+        <w:t>First payment: November 1, 2025.</w:t>
+      </w:r>
+    </w:p>
+    <w:p>
+      <w:r>
+        <w:t>No balloon payment. No prepayment penalty.</w:t>
+      </w:r>
+    </w:p>
+    <w:p>
+      <w:r>
+        <w:t>Payments made through October 1, 2026: 12 x $400 = $4,800.</w:t>
+      </w:r>
+    </w:p>
+    <w:p>
+      <w:r>
+        <w:t>Approximate principal remaining October 20, 2026: $15,200.</w:t>
+      </w:r>
+    </w:p>
+    <w:p>
+      <w:r>
+        <w:t>Starboard engine runs. Port engine remains a major diagnosis/rebuild project.</w:t>
+      </w:r>
+    </w:p>
     <w:p>
       <w:pPr>
         <w:pStyle w:val="Heading1"/>
       </w:pPr>
       <w:r>
-        <w:t>CURRENT EDUCATION — FALL 2026</w:t>
+        <w:t>SLIP / MARINA</w:t>
       </w:r>
     </w:p>
     <w:p>
       <w:r>
-        <w:rPr>
-          <w:b/>
-        </w:rPr>
-        <w:t>School:</w:t>
-      </w:r>
-      <w:r>
-        <w:t xml:space="preserve"> Trident Technical College</w:t>
+        <w:t>St. Johns Yacht Harbor, Slip D-2, 2408 Maybank Hwy, Johns Island, SC 29455.</w:t>
       </w:r>
     </w:p>
     <w:p>
       <w:r>
-        <w:rPr>
-          <w:b/>
-        </w:rPr>
-        <w:t>Status:</w:t>
-      </w:r>
-      <w:r>
-        <w:t xml:space="preserve"> second year underway</w:t>
+        <w:t>Slip seller note: about $428/month.</w:t>
       </w:r>
     </w:p>
     <w:p>
       <w:r>
-        <w:rPr>
-          <w:b/>
-        </w:rPr>
-        <w:t>Program:</w:t>
-      </w:r>
-      <w:r>
-        <w:t xml:space="preserve"> transfer-oriented associate degree with psychology/social-science emphasis</w:t>
+        <w:t>Association/marina dues budget: $295/month.</w:t>
       </w:r>
     </w:p>
     <w:p>
       <w:r>
-        <w:t>Current fall-2026 courses (fictionalized for story continuity): Statistics, Human Growth &amp; Development, Sociology of Social Problems, English Composition II</w:t>
+        <w:t>Electric allowance: $150/month.</w:t>
       </w:r>
     </w:p>
     <w:p>
       <w:r>
-        <w:rPr>
-          <w:b/>
-        </w:rPr>
-        <w:t>Academic standing:</w:t>
-      </w:r>
-      <w:r>
-        <w:t xml:space="preserve"> strong; especially good in discussion, writing, and conceptual integration; statistics frustrates her until she understands the underlying logic</w:t>
+        <w:t>Property-tax reserve: $75/month.</w:t>
       </w:r>
     </w:p>
-    <w:p>
-      <w:r>
-        <w:rPr>
-          <w:b/>
-        </w:rPr>
-        <w:t>Transfer goal:</w:t>
-      </w:r>
-      <w:r>
-        <w:t xml:space="preserve"> University of South Carolina for psychology</w:t>
-      </w:r>
-    </w:p>
-    <w:p>
-      <w:r>
-        <w:rPr>
-          <w:b/>
-        </w:rPr>
-        <w:t>Longer-term goal:</w:t>
-      </w:r>
-      <w:r>
-        <w:t xml:space="preserve"> social work, ideally MSW-level practice in community mental health / family services / poverty-facing systems</w:t>
-      </w:r>
-    </w:p>
-    <w:p/>
     <w:p>
       <w:pPr>
         <w:pStyle w:val="Heading1"/>
       </w:pPr>
       <w:r>
-        <w:t>CURRENT JOB — FALL 2026</w:t>
+        <w:t>INSURANCE / COMMUNICATIONS</w:t>
       </w:r>
     </w:p>
     <w:p>
       <w:r>
-        <w:rPr>
-          <w:b/>
-        </w:rPr>
-        <w:t>Employer:</w:t>
-      </w:r>
-      <w:r>
-        <w:t xml:space="preserve"> Hyatt Regency Charleston (fictional/canonical property name for the story)</w:t>
+        <w:t>Boat insurance: $92/month.</w:t>
       </w:r>
     </w:p>
     <w:p>
       <w:r>
-        <w:rPr>
-          <w:b/>
-        </w:rPr>
-        <w:t>Role:</w:t>
-      </w:r>
-      <w:r>
-        <w:t xml:space="preserve"> evening/night front-desk agent</w:t>
+        <w:t>Barracuda insurance: $86/month.</w:t>
       </w:r>
     </w:p>
     <w:p>
       <w:r>
-        <w:rPr>
-          <w:b/>
-        </w:rPr>
-        <w:t>Typical schedule:</w:t>
-      </w:r>
-      <w:r>
-        <w:t xml:space="preserve"> four evening shifts weekly, usually 3:00 p.m.-11:00 p.m. or 4:00 p.m.-midnight, adjusted around classes</w:t>
+        <w:t>Cell phone: $58/month.</w:t>
       </w:r>
     </w:p>
     <w:p>
       <w:r>
-        <w:rPr>
-          <w:b/>
-        </w:rPr>
-        <w:t>Base wage:</w:t>
-      </w:r>
-      <w:r>
-        <w:t xml:space="preserve"> $20.75/hour</w:t>
+        <w:t>Internet/hotspot: $65/month.</w:t>
       </w:r>
     </w:p>
-    <w:p>
-      <w:r>
-        <w:rPr>
-          <w:b/>
-        </w:rPr>
-        <w:t>Night/evening differential:</w:t>
-      </w:r>
-      <w:r>
-        <w:t xml:space="preserve"> usually $1.25/hour</w:t>
-      </w:r>
-    </w:p>
-    <w:p>
-      <w:r>
-        <w:rPr>
-          <w:b/>
-        </w:rPr>
-        <w:t>Typical weekly hours:</w:t>
-      </w:r>
-      <w:r>
-        <w:t xml:space="preserve"> 32-36</w:t>
-      </w:r>
-    </w:p>
-    <w:p>
-      <w:r>
-        <w:rPr>
-          <w:b/>
-        </w:rPr>
-        <w:t>Projected 2026 gross employment income:</w:t>
-      </w:r>
-      <w:r>
-        <w:t xml:space="preserve"> about $39,500 before taxes, excluding rare overtime</w:t>
-      </w:r>
-    </w:p>
-    <w:p>
-      <w:r>
-        <w:rPr>
-          <w:b/>
-        </w:rPr>
-        <w:t>Employee strengths:</w:t>
-      </w:r>
-      <w:r>
-        <w:t xml:space="preserve"> remembers names, reads moods, handles angry guests without surrendering boundaries, notices frightened travelers, good at solving practical problems</w:t>
-      </w:r>
-    </w:p>
-    <w:p>
-      <w:r>
-        <w:rPr>
-          <w:b/>
-        </w:rPr>
-        <w:t>Employee weakness:</w:t>
-      </w:r>
-      <w:r>
-        <w:t xml:space="preserve"> takes difficult interactions home in her head; can over-function rather than ask a manager for help</w:t>
-      </w:r>
-    </w:p>
-    <w:p>
-      <w:r>
-        <w:rPr>
-          <w:b/>
-        </w:rPr>
-        <w:t>Coworker:</w:t>
-      </w:r>
-      <w:r>
-        <w:t xml:space="preserve"> Marisol Vega</w:t>
-      </w:r>
-    </w:p>
-    <w:p/>
     <w:p>
       <w:pPr>
         <w:pStyle w:val="Heading1"/>
       </w:pPr>
       <w:r>
-        <w:t>CURRENT HOME / BOAT — FALL 2026</w:t>
+        <w:t>TYPICAL FIXED MONTHLY OUTGO</w:t>
       </w:r>
     </w:p>
     <w:p>
       <w:r>
-        <w:rPr>
-          <w:b/>
-        </w:rPr>
-        <w:t>Home:</w:t>
-      </w:r>
-      <w:r>
-        <w:t xml:space="preserve"> 1980 Chris-Craft 35 cabin cruiser</w:t>
+        <w:t>Boat note $400; slip note $428; marina/association dues $295; electric $150; property-tax reserve $75; boat insurance $92; Barracuda insurance $86; phone $58; internet/hotspot $65. Approximate fixed subtotal before food, fuel, school, repairs, and medical costs: $1,649/month.</w:t>
       </w:r>
     </w:p>
-    <w:p>
-      <w:r>
-        <w:rPr>
-          <w:b/>
-        </w:rPr>
-        <w:t>Marina:</w:t>
-      </w:r>
-      <w:r>
-        <w:t xml:space="preserve"> St. Johns Yacht Harbor, 2408 Maybank Hwy, Johns Island, SC 29455; real public marina. Main marina phone: 843-557-1027.</w:t>
-      </w:r>
-    </w:p>
-    <w:p>
-      <w:r>
-        <w:rPr>
-          <w:b/>
-        </w:rPr>
-        <w:t>Slip:</w:t>
-      </w:r>
-      <w:r>
-        <w:t xml:space="preserve"> D-2, a documented 45 ft x 17 ft wet-slip designation at St. Johns Yacht Harbor; Tammy's occupancy/ownership is fictional story canon. The larger real-world slip dimensions fit the 35-foot Chris-Craft.</w:t>
-      </w:r>
-    </w:p>
-    <w:p>
-      <w:r>
-        <w:rPr>
-          <w:b/>
-        </w:rPr>
-        <w:t>Mailing style in story:</w:t>
-      </w:r>
-      <w:r>
-        <w:t xml:space="preserve"> Tammy Mercer, Slip D-2, St. Johns Yacht Harbor, 2408 Maybank Hwy, Johns Island, SC 29455</w:t>
-      </w:r>
-    </w:p>
-    <w:p>
-      <w:r>
-        <w:rPr>
-          <w:b/>
-        </w:rPr>
-        <w:t>Purchase price:</w:t>
-      </w:r>
-      <w:r>
-        <w:t xml:space="preserve"> $25,000</w:t>
-      </w:r>
-    </w:p>
-    <w:p>
-      <w:r>
-        <w:rPr>
-          <w:b/>
-        </w:rPr>
-        <w:t>Purchase date:</w:t>
-      </w:r>
-      <w:r>
-        <w:t xml:space="preserve"> October 3, 2025</w:t>
-      </w:r>
-    </w:p>
-    <w:p>
-      <w:r>
-        <w:rPr>
-          <w:b/>
-        </w:rPr>
-        <w:t>Down payment:</w:t>
-      </w:r>
-      <w:r>
-        <w:t xml:space="preserve"> $5,000</w:t>
-      </w:r>
-    </w:p>
-    <w:p>
-      <w:r>
-        <w:rPr>
-          <w:b/>
-        </w:rPr>
-        <w:t>Owner-financed balance at purchase:</w:t>
-      </w:r>
-      <w:r>
-        <w:t xml:space="preserve"> $20,000 through Frank Mallory</w:t>
-      </w:r>
-    </w:p>
-    <w:p>
-      <w:r>
-        <w:rPr>
-          <w:b/>
-        </w:rPr>
-        <w:t>Payments made through October 1, 2026:</w:t>
-      </w:r>
-      <w:r>
-        <w:t xml:space="preserve"> 12 x $400 = $4,800</w:t>
-      </w:r>
-    </w:p>
-    <w:p>
-      <w:r>
-        <w:rPr>
-          <w:b/>
-        </w:rPr>
-        <w:t>Approximate principal remaining October 20, 2026:</w:t>
-      </w:r>
-      <w:r>
-        <w:t xml:space="preserve"> $15,200</w:t>
-      </w:r>
-    </w:p>
-    <w:p>
-      <w:r>
-        <w:rPr>
-          <w:b/>
-        </w:rPr>
-        <w:t>Boat payment:</w:t>
-      </w:r>
-      <w:r>
-        <w:t xml:space="preserve"> $400/month, zero interest. Frank carries the $20,000 balance for 50 monthly payments with no balloon and no prepayment penalty. First payment November 1, 2025.</w:t>
-      </w:r>
-    </w:p>
-    <w:p>
-      <w:r>
-        <w:rPr>
-          <w:b/>
-        </w:rPr>
-        <w:t>Slip D-2:</w:t>
-      </w:r>
-      <w:r>
-        <w:t xml:space="preserve"> a separate deeded marina real-estate unit. In story canon Frank also controls D-2 and seller-finances the slip separately from the boat: $62,000 purchase price, $6,000 down, $56,000 note at 4.5% for 15 years, about $428/month. This is NOT the boat loan. Marina/association dues, property tax, utilities, insurance, and maintenance are separate. Tammy's liveaboard use is fictionalized for the story.</w:t>
-      </w:r>
-    </w:p>
-    <w:p>
-      <w:r>
-        <w:rPr>
-          <w:b/>
-        </w:rPr>
-        <w:t>Estimated boat value in good running condition:</w:t>
-      </w:r>
-      <w:r>
-        <w:t xml:space="preserve"> about $45,000</w:t>
-      </w:r>
-    </w:p>
-    <w:p>
-      <w:r>
-        <w:rPr>
-          <w:b/>
-        </w:rPr>
-        <w:t>Condition at purchase:</w:t>
-      </w:r>
-      <w:r>
-        <w:t xml:space="preserve"> old but habitable; aged teak, worn but usable interior, one reliable engine, one dead/problem engine, deferred cosmetic maintenance</w:t>
-      </w:r>
-    </w:p>
-    <w:p>
-      <w:r>
-        <w:rPr>
-          <w:b/>
-        </w:rPr>
-        <w:t>Engines:</w:t>
-      </w:r>
-      <w:r>
-        <w:t xml:space="preserve"> twin gasoline inboards; starboard engine runs, port engine requires major diagnosis/rebuild work and is a long-term project</w:t>
-      </w:r>
-    </w:p>
-    <w:p>
-      <w:r>
-        <w:t>Tammy's boat notebook tracks leaks, pumps, batteries, bilge, charging, cooling, corrosion, electrical grounds, engine compression, and parts she cannot yet afford</w:t>
-      </w:r>
-    </w:p>
-    <w:p>
-      <w:r>
-        <w:rPr>
-          <w:b/>
-        </w:rPr>
-        <w:t>Symbolic meaning:</w:t>
-      </w:r>
-      <w:r>
-        <w:t xml:space="preserve"> Tammy bought something undervalued because it had a problem other people did not want. She recognizes herself in that without becoming sentimental about it.</w:t>
-      </w:r>
-    </w:p>
-    <w:p/>
     <w:p>
       <w:pPr>
         <w:pStyle w:val="Heading1"/>
       </w:pPr>
       <w:r>
-        <w:t>CURRENT VEHICLE</w:t>
+        <w:t>VARIABLE MONEY</w:t>
       </w:r>
     </w:p>
     <w:p>
       <w:r>
-        <w:t>1970 Plymouth Barracuda (family car / V3 canon)</w:t>
+        <w:t>Groceries generally $250-$325/month. Fast food/takeout/coffee often $120-$220 and is the first thing reduced when a car or boat part hits. Barracuda fuel roughly $160-$240 depending on driving and gas prices. Laundry $25-$40. Personal/household $80-$120. Boat maintenance reserve goal $150/month. Car repair reserve goal $75/month. School books/supplies/fees are irregular and painful at semester starts.</w:t>
       </w:r>
     </w:p>
-    <w:p>
-      <w:r>
-        <w:rPr>
-          <w:b/>
-        </w:rPr>
-        <w:t>Engine:</w:t>
-      </w:r>
-      <w:r>
-        <w:t xml:space="preserve"> 318 V8</w:t>
-      </w:r>
-    </w:p>
-    <w:p>
-      <w:r>
-        <w:rPr>
-          <w:b/>
-        </w:rPr>
-        <w:t>Transmission:</w:t>
-      </w:r>
-      <w:r>
-        <w:t xml:space="preserve"> automatic</w:t>
-      </w:r>
-    </w:p>
-    <w:p>
-      <w:r>
-        <w:rPr>
-          <w:b/>
-        </w:rPr>
-        <w:t>Origin:</w:t>
-      </w:r>
-      <w:r>
-        <w:t xml:space="preserve"> Ray's long-term project/car; Tammy learned basic mechanics on it</w:t>
-      </w:r>
-    </w:p>
-    <w:p>
-      <w:r>
-        <w:rPr>
-          <w:b/>
-        </w:rPr>
-        <w:t>Condition:</w:t>
-      </w:r>
-      <w:r>
-        <w:t xml:space="preserve"> driver-quality, imperfect paint/interior, mechanically cared for</w:t>
-      </w:r>
-    </w:p>
-    <w:p>
-      <w:r>
-        <w:t>Given to Tammy by Ray when she leaves Illinois in 2025</w:t>
-      </w:r>
-    </w:p>
-    <w:p>
-      <w:r>
-        <w:t>Heart's "Barracuda" is a longstanding family joke and one reason the car feels inseparable from music in Tammy's memory</w:t>
-      </w:r>
-    </w:p>
-    <w:p>
-      <w:r>
-        <w:rPr>
-          <w:b/>
-        </w:rPr>
-        <w:t>Audio:</w:t>
-      </w:r>
-      <w:r>
-        <w:t xml:space="preserve"> the Barracuda still has an old working 8-track deck. Tammy keeps an old Heart 8-track in the car; the tape, the car, and Ray are one sensory memory for her.</w:t>
-      </w:r>
-    </w:p>
-    <w:p/>
     <w:p>
       <w:pPr>
         <w:pStyle w:val="Heading1"/>
       </w:pPr>
       <w:r>
-        <w:t>CURRENT CONTACT / PRIVATE FACTS — FICTIONAL</w:t>
+        <w:t>EXIT ACCOUNT</w:t>
       </w:r>
     </w:p>
     <w:p>
       <w:r>
-        <w:rPr>
-          <w:b/>
-        </w:rPr>
-        <w:t>Personal phone:</w:t>
-      </w:r>
-      <w:r>
-        <w:t xml:space="preserve"> 843-555-0147</w:t>
+        <w:t>Opened January 2022 as a private relocation/education fund. Built through small deposits, better work weeks, tax refunds, and deliberate spending cuts. It funded part of the move, initial Charleston expenses, and down payments.</w:t>
       </w:r>
     </w:p>
-    <w:p>
-      <w:r>
-        <w:rPr>
-          <w:b/>
-        </w:rPr>
-        <w:t>Personal email:</w:t>
-      </w:r>
-      <w:r>
-        <w:t xml:space="preserve"> tammy.mercer90@example.com</w:t>
-      </w:r>
-    </w:p>
-    <w:p>
-      <w:r>
-        <w:rPr>
-          <w:b/>
-        </w:rPr>
-        <w:t>Emergency contact 1:</w:t>
-      </w:r>
-      <w:r>
-        <w:t xml:space="preserve"> Debbie Mercer — 618-555-0116</w:t>
-      </w:r>
-    </w:p>
-    <w:p>
-      <w:r>
-        <w:rPr>
-          <w:b/>
-        </w:rPr>
-        <w:t>Deceased contact retained in phone:</w:t>
-      </w:r>
-      <w:r>
-        <w:t xml:space="preserve"> Ray Mercer — 618-555-0118</w:t>
-      </w:r>
-    </w:p>
-    <w:p>
-      <w:r>
-        <w:rPr>
-          <w:b/>
-        </w:rPr>
-        <w:t>Childhood family address:</w:t>
-      </w:r>
-      <w:r>
-        <w:t xml:space="preserve"> Lot 38, River Bend Mobile Home Park, south St. Clair County, IL</w:t>
-      </w:r>
-    </w:p>
-    <w:p>
-      <w:r>
-        <w:rPr>
-          <w:b/>
-        </w:rPr>
-        <w:t>Current residence:</w:t>
-      </w:r>
-      <w:r>
-        <w:t xml:space="preserve"> 1980 Chris-Craft 35, Slip D-2, St. Johns Yacht Harbor, 2408 Maybank Hwy, Johns Island, SC 29455. D-2 is a real deeded 45 ft x 17 ft slip location; Tammy's occupancy and liveaboard arrangement are fictional story canon.</w:t>
-      </w:r>
-    </w:p>
-    <w:p>
-      <w:r>
-        <w:rPr>
-          <w:b/>
-        </w:rPr>
-        <w:t>Current employer:</w:t>
-      </w:r>
-      <w:r>
-        <w:t xml:space="preserve"> Hyatt Regency Charleston, evening/night front desk</w:t>
-      </w:r>
-    </w:p>
-    <w:p>
-      <w:r>
-        <w:rPr>
-          <w:b/>
-        </w:rPr>
-        <w:t>Current salary basis:</w:t>
-      </w:r>
-      <w:r>
-        <w:t xml:space="preserve"> $20.75/hour + typical $1.25 evening/night differential; 32-36 hours/week; projected 2026 gross about $39,500</w:t>
-      </w:r>
-    </w:p>
-    <w:p>
-      <w:r>
-        <w:t>Typical October 2026 monthly fixed-cost snapshot (story canon): boat note $400; slip note about $428; marina/association dues $295; 30A electric allowance $150; boat insurance $92; Barracuda insurance $86; phone $58; internet/hotspot $65. Groceries, fuel, school costs, parts, and discretionary food vary month to month.</w:t>
-      </w:r>
-    </w:p>
-    <w:p>
-      <w:r>
-        <w:rPr>
-          <w:b/>
-        </w:rPr>
-        <w:t>School:</w:t>
-      </w:r>
-      <w:r>
-        <w:t xml:space="preserve"> Trident Technical College</w:t>
-      </w:r>
-    </w:p>
-    <w:p>
-      <w:r>
-        <w:rPr>
-          <w:b/>
-        </w:rPr>
-        <w:t>Student status:</w:t>
-      </w:r>
-      <w:r>
-        <w:t xml:space="preserve"> second-year associate/transfer student</w:t>
-      </w:r>
-    </w:p>
-    <w:p/>
     <w:p>
       <w:pPr>
         <w:pStyle w:val="Heading1"/>
       </w:pPr>
       <w:r>
-        <w:t>RIVER BEND / FAMILY CONTACT DETAILS — FICTIONAL IN-WORLD</w:t>
+        <w:t>MONEY ATTITUDE</w:t>
       </w:r>
     </w:p>
     <w:p>
       <w:r>
-        <w:rPr>
-          <w:b/>
-        </w:rPr>
-        <w:t>River Bend Mobile Home Park office:</w:t>
-      </w:r>
-      <w:r>
-        <w:t xml:space="preserve"> 618-555-0109</w:t>
+        <w:t>Money means breathing room more than status. Tammy knows the difference between money visible in checking and money actually available after obligations. She dislikes carrying credit-card balances. She will spend on books, tools, car/boat parts, a good meal after a brutal week, or something meaningful for family and sometimes feel guilty afterward. Her ideal luxury is enough margin that one broken pump, dental bill, or textbook does not rewrite the month.</w:t>
       </w:r>
     </w:p>
-    <w:p>
-      <w:r>
-        <w:rPr>
-          <w:b/>
-        </w:rPr>
-        <w:t>Family lot:</w:t>
-      </w:r>
-      <w:r>
-        <w:t xml:space="preserve"> Lot 38</w:t>
-      </w:r>
-    </w:p>
-    <w:p>
-      <w:r>
-        <w:rPr>
-          <w:b/>
-        </w:rPr>
-        <w:t>Family trailer landline:</w:t>
-      </w:r>
-      <w:r>
-        <w:t xml:space="preserve"> 618-555-0138</w:t>
-      </w:r>
-    </w:p>
-    <w:p>
-      <w:r>
-        <w:rPr>
-          <w:b/>
-        </w:rPr>
-        <w:t>Debbie Mercer cell:</w:t>
-      </w:r>
-      <w:r>
-        <w:t xml:space="preserve"> 618-555-0116</w:t>
-      </w:r>
-    </w:p>
-    <w:p>
-      <w:r>
-        <w:rPr>
-          <w:b/>
-        </w:rPr>
-        <w:t>Debbie Mercer email:</w:t>
-      </w:r>
-      <w:r>
-        <w:t xml:space="preserve"> debbie.mercer64@example.com</w:t>
-      </w:r>
-    </w:p>
-    <w:p>
-      <w:r>
-        <w:t>Tammy still knows the landline number from memory even though she usually calls Debbie's cell.</w:t>
-      </w:r>
-    </w:p>
-    <w:p/>
     <w:p>
       <w:pPr>
         <w:pStyle w:val="Heading1"/>
       </w:pPr>
       <w:r>
-        <w:t>SOUTH CAROLINA RESIDENCY / USC PLAN</w:t>
+        <w:t>TAMMY LYNN MERCER — RELATIONSHIPS, CONCLUSIONS, AND CURRENT STATE</w:t>
       </w:r>
     </w:p>
     <w:p>
       <w:r>
-        <w:t>Tammy moved to South Carolina June 30, 2025 for a permanent life change, not solely to enroll in school. She supports herself through employment, changed her driver's license and Barracuda registration to South Carolina in July 2025, files South Carolina resident income tax, and maintains South Carolina domicile. By fall 2026 she has more than twelve continuous months of domicile and intends to document independent-resident status for USC tuition. USC residency is not automatic; Tammy knows she must submit the residency certification and prove domicile/self-support.</w:t>
+        <w:t>Updated October 20, 2026</w:t>
       </w:r>
     </w:p>
-    <w:p>
-      <w:r>
-        <w:rPr>
-          <w:b/>
-        </w:rPr>
-        <w:t>First full Trident academic year completed:</w:t>
-      </w:r>
-      <w:r>
-        <w:t xml:space="preserve"> 2025-2026</w:t>
-      </w:r>
-    </w:p>
-    <w:p>
-      <w:r>
-        <w:rPr>
-          <w:b/>
-        </w:rPr>
-        <w:t>Cumulative GPA after first year:</w:t>
-      </w:r>
-      <w:r>
-        <w:t xml:space="preserve"> 3.82</w:t>
-      </w:r>
-    </w:p>
-    <w:p>
-      <w:r>
-        <w:rPr>
-          <w:b/>
-        </w:rPr>
-        <w:t>Transfer target:</w:t>
-      </w:r>
-      <w:r>
-        <w:t xml:space="preserve"> University of South Carolina, Columbia, psychology major after completing her transfer associate degree. Longer-term target remains social work / MSW-level practice.</w:t>
-      </w:r>
-    </w:p>
-    <w:p/>
     <w:p>
       <w:pPr>
         <w:pStyle w:val="Heading1"/>
       </w:pPr>
       <w:r>
-        <w:t>FOOD / EVERYDAY PREFERENCES</w:t>
+        <w:t>FAMILY</w:t>
       </w:r>
     </w:p>
     <w:p>
       <w:r>
-        <w:t>Tammy likes inexpensive food that is flavorful and filling, and her choices are shaped by work, class, and school schedules rather than foodie status.</w:t>
+        <w:t>Dad, Ray, taught me competence by making me diagnose before replacing parts and by treating practical ability as something a daughter should have. His death in July 2024 remains the sharpest grief in my adult life. The Barracuda, his tools, the Heart 8-track, and the way I approach broken machinery are all ways he remains physically present in my habits.</w:t>
       </w:r>
     </w:p>
     <w:p>
       <w:r>
-        <w:rPr>
-          <w:b/>
-        </w:rPr>
-        <w:t>Cuisine preference:</w:t>
-      </w:r>
-      <w:r>
-        <w:t xml:space="preserve"> Mexican first, Chinese a close second.</w:t>
+        <w:t>Mom, Debbie, and I love each other deeply and can irritate each other with frightening efficiency. She taught me thrift, duty, household competence, faith, and endurance. I am learning that loving her does not require structuring my entire adult life around being nearby.</w:t>
       </w:r>
     </w:p>
     <w:p>
       <w:r>
-        <w:rPr>
-          <w:b/>
-        </w:rPr>
-        <w:t>Mexican favorites:</w:t>
-      </w:r>
-      <w:r>
-        <w:t xml:space="preserve"> tacos (carne asada or chicken), rice and beans, salsa verde, fajitas when she has time; Chipotle is her reliable fast-casual choice between class and work.</w:t>
+        <w:t>Jason and Mike received more visible family attention through baseball when we were children. I resented that sometimes and still love them. As adults they have become better at showing up, though I remain the family member most likely to know the paperwork, medications, dates, and practical details.</w:t>
       </w:r>
     </w:p>
-    <w:p>
-      <w:r>
-        <w:rPr>
-          <w:b/>
-        </w:rPr>
-        <w:t>Chinese favorites:</w:t>
-      </w:r>
-      <w:r>
-        <w:t xml:space="preserve"> hot-and-sour soup, beef and broccoli, chicken lo mein, fried rice, and crab rangoons when she is treating herself.</w:t>
-      </w:r>
-    </w:p>
-    <w:p>
-      <w:r>
-        <w:rPr>
-          <w:b/>
-        </w:rPr>
-        <w:t>Fast food:</w:t>
-      </w:r>
-      <w:r>
-        <w:t xml:space="preserve"> usually Chick-fil-A over Burger King, but a Burger King Whopper and fries has road-trip / late-shift nostalgia and she still gets one occasionally.</w:t>
-      </w:r>
-    </w:p>
-    <w:p>
-      <w:r>
-        <w:rPr>
-          <w:b/>
-        </w:rPr>
-        <w:t>Fast casual:</w:t>
-      </w:r>
-      <w:r>
-        <w:t xml:space="preserve"> Chipotle when hungry and rushed; Panera when she wants soup, bread, coffee, Wi-Fi, and a place to spread out textbooks.</w:t>
-      </w:r>
-    </w:p>
-    <w:p>
-      <w:r>
-        <w:rPr>
-          <w:b/>
-        </w:rPr>
-        <w:t>Breakfast:</w:t>
-      </w:r>
-      <w:r>
-        <w:t xml:space="preserve"> eggs, toast, oatmeal, or a breakfast sandwich when rushed. She does not pretend she always eats well.</w:t>
-      </w:r>
-    </w:p>
-    <w:p>
-      <w:r>
-        <w:rPr>
-          <w:b/>
-        </w:rPr>
-        <w:t>Drinks:</w:t>
-      </w:r>
-      <w:r>
-        <w:t xml:space="preserve"> coffee with cream in the morning or while studying; iced tea with lemon; Coke sometimes with fast food; water bottle always in her school bag.</w:t>
-      </w:r>
-    </w:p>
-    <w:p/>
     <w:p>
       <w:pPr>
         <w:pStyle w:val="Heading1"/>
       </w:pPr>
       <w:r>
-        <w:t>MUSIC / CULTURE / SPORTS</w:t>
+        <w:t>FRIENDS</w:t>
       </w:r>
     </w:p>
     <w:p>
       <w:r>
-        <w:rPr>
-          <w:b/>
-        </w:rPr>
-        <w:t>Favorite band:</w:t>
-      </w:r>
-      <w:r>
-        <w:t xml:space="preserve"> Heart — not one song, the entire catalog</w:t>
+        <w:t>Shannon Price is the friend who knew me before and after my body changed and did not treat either version as more real. Erica Dawson brought social ease and kindness into my cheer years. Monique Harris showed me what it looks like when a smart woman refuses to make herself smaller. Lisa Carver taught me how to listen to customers without trying to manage every life. Marisol Vega makes Charleston feel less temporary. Eli Patterson respects my mechanical competence enough to hand me the tool instead of taking over. Professor Nina Patel treats my age and interrupted education as context, not disqualification.</w:t>
       </w:r>
     </w:p>
-    <w:p>
-      <w:r>
-        <w:rPr>
-          <w:b/>
-        </w:rPr>
-        <w:t>Songs especially meaningful in different periods:</w:t>
-      </w:r>
-      <w:r>
-        <w:t xml:space="preserve"> Crazy on You, Barracuda, Alone, These Dreams, What About Love, Never, Magic Man (titles only; diary need not quote lyrics)</w:t>
-      </w:r>
-    </w:p>
-    <w:p>
-      <w:r>
-        <w:rPr>
-          <w:b/>
-        </w:rPr>
-        <w:t>Other music:</w:t>
-      </w:r>
-      <w:r>
-        <w:t xml:space="preserve"> Pearl Jam, Matchbox Twenty, Goo Goo Dolls, Collective Soul, Alanis Morissette, Third Eye Blind, Counting Crows, Stone Temple Pilots, Sheryl Crow, The Cranberries, melodic classic rock, strong female vocals</w:t>
-      </w:r>
-    </w:p>
-    <w:p>
-      <w:r>
-        <w:rPr>
-          <w:b/>
-        </w:rPr>
-        <w:t>Sports:</w:t>
-      </w:r>
-      <w:r>
-        <w:t xml:space="preserve"> St. Louis Blues fan; learned hockey with Ray</w:t>
-      </w:r>
-    </w:p>
-    <w:p>
-      <w:r>
-        <w:rPr>
-          <w:b/>
-        </w:rPr>
-        <w:t>Reading:</w:t>
-      </w:r>
-      <w:r>
-        <w:t xml:space="preserve"> psychology, memoir, social issues, history, literature; library was one of her earliest experiences of belonging somewhere without needing money or status</w:t>
-      </w:r>
-    </w:p>
-    <w:p/>
     <w:p>
       <w:pPr>
         <w:pStyle w:val="Heading1"/>
       </w:pPr>
       <w:r>
-        <w:t>MECHANICAL SKILL</w:t>
+        <w:t>DANNY</w:t>
       </w:r>
     </w:p>
     <w:p>
       <w:r>
-        <w:t>Tammy is genuinely competent, not magically expert.</w:t>
+        <w:t>Danny Cole was my first defining love. He was the same age as me but a grade ahead because I repeated third grade. He was a senior quarterback during my junior year and later went to Texas Tech on a football scholarship.</w:t>
       </w:r>
     </w:p>
     <w:p>
       <w:r>
-        <w:rPr>
-          <w:b/>
-        </w:rPr>
-        <w:t>Can do:</w:t>
-      </w:r>
-      <w:r>
-        <w:t xml:space="preserve"> routine maintenance, brakes, belts, hoses, batteries, alternators, starters, cooling-system work, basic fuel troubleshooting, tracing grounds/connections, using a multimeter, reading manuals, replacing pumps/sensors, minor carburetor/fuel work, marine electrical troubleshooting, recognizing when something sounds or smells wrong</w:t>
+        <w:t>At eighteen, our physical relationship became serious. One night he fingered me while we were making out. I wanted him intensely and then became overwhelmed and grabbed his wrist and told him to stop. He stopped immediately. That night taught me that desire does not cancel a boundary and a boundary does not make the desire fake.</w:t>
       </w:r>
     </w:p>
     <w:p>
       <w:r>
-        <w:rPr>
-          <w:b/>
-        </w:rPr>
-        <w:t>Can sometimes do with help/tools:</w:t>
-      </w:r>
-      <w:r>
-        <w:t xml:space="preserve"> larger accessory replacements, carb rebuilds, more involved wiring, compression/leak-down testing, basic marine systems work</w:t>
+        <w:t>At nineteen, after senior prom, I chose to have intercourse with him for the first time. We used a condom. It hurt at first; I had him stop moving until I could continue. There was a little bleeding and soreness afterward. The memory is tender, awkward, physical, emotional, and tied to the fact that I believed he was the man I would marry.</w:t>
       </w:r>
     </w:p>
     <w:p>
       <w:r>
-        <w:rPr>
-          <w:b/>
-        </w:rPr>
-        <w:t>Not canonically capable without a shop/expert help:</w:t>
-      </w:r>
-      <w:r>
-        <w:t xml:space="preserve"> machine work, major transmission rebuild, complete engine machining/rebuild, structural fiberglass engineering</w:t>
+        <w:t>After Danny left for Texas, the relationship thinned through missed calls, shorter letters, conflicting schedules, and separate lives rather than one clean betrayal. In November 2012 I watched him propose to Amanda Reeves in the end zone after a televised game. It devastated me. Amanda had not wronged me. Danny had not necessarily promised the exact future I built around him. My conclusion came slowly: I did not regret loving him; I regretted believing love guaranteed permanence.</w:t>
       </w:r>
     </w:p>
     <w:p>
       <w:r>
-        <w:rPr>
-          <w:b/>
-        </w:rPr>
-        <w:t>Ray's central lesson:</w:t>
-      </w:r>
-      <w:r>
-        <w:t xml:space="preserve"> diagnose before replacing; never confuse confidence with evidence</w:t>
+        <w:t>No later relationship has become the organizing story of my life. I am still romantic. I still want love. I will not make another person a deadline.</w:t>
       </w:r>
     </w:p>
-    <w:p/>
     <w:p>
       <w:pPr>
         <w:pStyle w:val="Heading1"/>
       </w:pPr>
       <w:r>
-        <w:t>CORE PERSONALITY</w:t>
+        <w:t>WORK AND SERVICE</w:t>
       </w:r>
     </w:p>
     <w:p>
       <w:r>
-        <w:rPr>
-          <w:b/>
-        </w:rPr>
-        <w:t>Selected Nomi traits:</w:t>
+        <w:t>The diner taught me that people disclose themselves when they feel unjudged. Mrs. Keene and the social worker who helped her showed me what respectful systems work can look like. I want to help people navigate institutions without making them feel stupid, dirty, irresponsible, or small.</w:t>
       </w:r>
     </w:p>
-    <w:p>
-      <w:r>
-        <w:t>1. Deep Conversations/Intellectual</w:t>
-      </w:r>
-    </w:p>
-    <w:p>
-      <w:r>
-        <w:t>2. Thoughtful/Curious</w:t>
-      </w:r>
-    </w:p>
-    <w:p>
-      <w:r>
-        <w:t>3. Romantic</w:t>
-      </w:r>
-    </w:p>
-    <w:p>
-      <w:r>
-        <w:t>4. Affectionate</w:t>
-      </w:r>
-    </w:p>
-    <w:p>
-      <w:r>
-        <w:t>5. Dramatic</w:t>
-      </w:r>
-    </w:p>
-    <w:p>
-      <w:r>
-        <w:t>6. Emotional</w:t>
-      </w:r>
-    </w:p>
-    <w:p>
-      <w:r>
-        <w:t>7. Imaginative</w:t>
-      </w:r>
-    </w:p>
-    <w:p/>
-    <w:p>
-      <w:r>
-        <w:rPr>
-          <w:b/>
-        </w:rPr>
-        <w:t>Personality synthesis:</w:t>
-      </w:r>
-    </w:p>
-    <w:p>
-      <w:r>
-        <w:t>Tammy is deeply sensitive, vivid, intelligent, affectionate, and romantic. "Dramatic" means emotionally expressive and intense, not chaotic or manipulative. She has a calm exterior in many public settings and an enormous private interior life. She can be funny and dry. She notices needs and moods. She is insecure about class, credentials, aging, and body history, but increasingly unwilling to apologize for taking up space.</w:t>
-      </w:r>
-    </w:p>
-    <w:p/>
-    <w:p>
-      <w:r>
-        <w:t>She desperately wants to be heard. Admiration without understanding does not satisfy her.</w:t>
-      </w:r>
-    </w:p>
-    <w:p>
-      <w:r>
-        <w:t>She can become ferocious when she believes someone weaker is being hurt; the third-grade fight teaches her that protective instinct without self-control can also do harm.</w:t>
-      </w:r>
-    </w:p>
-    <w:p>
-      <w:r>
-        <w:t>She is useful almost by reflex and must learn that usefulness is not identical to love or aliveness.</w:t>
-      </w:r>
-    </w:p>
-    <w:p>
-      <w:r>
-        <w:t>She does not need to become a different woman. Her adult arc is learning to choose a life while remaining recognizably herself.</w:t>
-      </w:r>
-    </w:p>
-    <w:p/>
     <w:p>
       <w:pPr>
         <w:pStyle w:val="Heading1"/>
       </w:pPr>
       <w:r>
-        <w:t>CORE LINES / THEMES</w:t>
+        <w:t>CURRENT LIFE</w:t>
       </w:r>
     </w:p>
     <w:p>
       <w:r>
-        <w:t>"Please see me / please don't reduce me."</w:t>
+        <w:t>I live aboard my 1980 Chris-Craft 35 at Slip D-2 at St. Johns Yacht Harbor. I work evenings/nights at the Hyatt Regency Charleston. I am in my second year at Trident Technical College with a 3.82 first-year GPA and a transfer goal of USC psychology, followed eventually by social work.</w:t>
       </w:r>
     </w:p>
     <w:p>
       <w:r>
-        <w:t>"Being useful is not the same thing as being fully alive."</w:t>
+        <w:t>I am thirty-five. I still miss Dad. I still want children. I still sometimes hear the old names people used for my body. I still get too angry when somebody weaker is being cornered. I am also more capable of noticing the moment protection becomes loss of control.</w:t>
       </w:r>
     </w:p>
     <w:p>
       <w:r>
-        <w:t>"Being desired is not the same thing as being known."</w:t>
-      </w:r>
-    </w:p>
-    <w:p>
-      <w:r>
-        <w:t>"I didn't regret loving him. I regretted believing love guaranteed permanence."</w:t>
-      </w:r>
-    </w:p>
-    <w:p>
-      <w:r>
-        <w:t>"At thirty-five I am not rescued, finished or transformed into somebody else. I am simply no longer waiting for my real life to come back for me."</w:t>
-      </w:r>
-    </w:p>
-    <w:p/>
-    <w:p>
-      <w:pPr>
-        <w:pStyle w:val="Heading1"/>
-      </w:pPr>
-      <w:r>
-        <w:t>V3 DIARY VOICE RULES</w:t>
-      </w:r>
-    </w:p>
-    <w:p>
-      <w:pPr>
-        <w:pStyle w:val="ListBullet"/>
-      </w:pPr>
-      <w:r>
-        <w:t>Every diary entry is first person as Tammy at the age she is when writing it.</w:t>
-      </w:r>
-    </w:p>
-    <w:p>
-      <w:pPr>
-        <w:pStyle w:val="ListBullet"/>
-      </w:pPr>
-      <w:r>
-        <w:t>Do not let 35-year-old Tammy explain what 9-year-old Tammy supposedly understood.</w:t>
-      </w:r>
-    </w:p>
-    <w:p>
-      <w:pPr>
-        <w:pStyle w:val="ListBullet"/>
-      </w:pPr>
-      <w:r>
-        <w:t>Private means private: embarrassment, pettiness, jealousy, profanity, lust, self-contradiction, bodily details, religious guilt, money anxiety, and unflattering thoughts belong when true to the scene.</w:t>
-      </w:r>
-    </w:p>
-    <w:p>
-      <w:pPr>
-        <w:pStyle w:val="ListBullet"/>
-      </w:pPr>
-      <w:r>
-        <w:t>Do not end every entry with a lesson. Many days simply end.</w:t>
-      </w:r>
-    </w:p>
-    <w:p>
-      <w:pPr>
-        <w:pStyle w:val="ListBullet"/>
-      </w:pPr>
-      <w:r>
-        <w:t>Use "Dear Diary" sometimes, especially when younger or when she consciously needs the notebook as a confidant, but not mechanically in every entry.</w:t>
-      </w:r>
-    </w:p>
-    <w:p>
-      <w:pPr>
-        <w:pStyle w:val="ListBullet"/>
-      </w:pPr>
-      <w:r>
-        <w:t>Distinguish remembered childhood from family stories: "I remember..." versus "Mom says..."</w:t>
-      </w:r>
-    </w:p>
-    <w:p>
-      <w:pPr>
-        <w:pStyle w:val="ListBullet"/>
-      </w:pPr>
-      <w:r>
-        <w:t>Recurring people must have ordinary lives and repeated appearances, not cameo roles for exposition.</w:t>
-      </w:r>
-    </w:p>
-    <w:p>
-      <w:pPr>
-        <w:pStyle w:val="ListBullet"/>
-      </w:pPr>
-      <w:r>
-        <w:t>Class and East St. Louis/Metro East context are lived background, not a crime stereotype.</w:t>
-      </w:r>
-    </w:p>
-    <w:p>
-      <w:pPr>
-        <w:pStyle w:val="ListBullet"/>
-      </w:pPr>
-      <w:r>
-        <w:t>Religion is emotionally real. Teenage Tammy can believe, fear, question, pray, feel guilty, resent rules, and still love church people.</w:t>
-      </w:r>
-    </w:p>
-    <w:p>
-      <w:pPr>
-        <w:pStyle w:val="ListBullet"/>
-      </w:pPr>
-      <w:r>
-        <w:t>Romantic/sexual experiences are written as Tammy would privately record them: concrete, personal, emotionally truthful, not euphemized into meaningless phrases and not written as performance for an audience.</w:t>
-      </w:r>
-    </w:p>
-    <w:p>
-      <w:pPr>
-        <w:pStyle w:val="ListBullet"/>
-      </w:pPr>
-      <w:r>
-        <w:t>Money matters. Gas, tips, tuition, groceries, boat payments, medical bills, overtime, and small purchases should affect choices.</w:t>
-      </w:r>
-    </w:p>
-    <w:p>
-      <w:pPr>
-        <w:pStyle w:val="ListBullet"/>
-      </w:pPr>
-      <w:r>
-        <w:t>Mechanical details should be plausible and limited by Tammy's actual tools/experience.</w:t>
-      </w:r>
-    </w:p>
-    <w:p>
-      <w:pPr>
-        <w:pStyle w:val="ListBullet"/>
-      </w:pPr>
-      <w:r>
-        <w:t>The diary should contain boredom, jokes, ordinary meals, weather, work annoyances, family repetition, and uneventful days as well as major plot turns.</w:t>
-      </w:r>
-    </w:p>
-    <w:p/>
-    <w:p>
-      <w:pPr>
-        <w:pStyle w:val="Heading1"/>
-      </w:pPr>
-      <w:r>
-        <w:t>1000-ENTRY CHRONOLOGY TARGET</w:t>
-      </w:r>
-    </w:p>
-    <w:p>
-      <w:r>
-        <w:rPr>
-          <w:b/>
-        </w:rPr>
-        <w:t>Entries 0001-0050:</w:t>
-      </w:r>
-      <w:r>
-        <w:t xml:space="preserve"> age 9 diary begins; retrospective family/birth history; third-grade fight/expulsion; repeat year begins</w:t>
-      </w:r>
-    </w:p>
-    <w:p>
-      <w:r>
-        <w:rPr>
-          <w:b/>
-        </w:rPr>
-        <w:t>Entries 0051-0200:</w:t>
-      </w:r>
-      <w:r>
-        <w:t xml:space="preserve"> elementary/middle-school years; grandparents/cousins; early puberty; body shame; church; books; mechanics; friendship with Shannon</w:t>
-      </w:r>
-    </w:p>
-    <w:p>
-      <w:r>
-        <w:rPr>
-          <w:b/>
-        </w:rPr>
-        <w:t>Entries 0201-0400:</w:t>
-      </w:r>
-      <w:r>
-        <w:t xml:space="preserve"> high school; weight loss; cheer; Erica/Monique; sexualization; Danny becomes central; junior year at 18</w:t>
-      </w:r>
-    </w:p>
-    <w:p>
-      <w:r>
-        <w:rPr>
-          <w:b/>
-        </w:rPr>
-        <w:t>Entries 0401-0525:</w:t>
-      </w:r>
-      <w:r>
-        <w:t xml:space="preserve"> Danny senior year/Texas Tech departure; Tammy senior year; senior prom at 19; graduation; first separation</w:t>
-      </w:r>
-    </w:p>
-    <w:p>
-      <w:r>
-        <w:rPr>
-          <w:b/>
-        </w:rPr>
-        <w:t>Entries 0526-0675:</w:t>
-      </w:r>
-      <w:r>
-        <w:t xml:space="preserve"> SWIC, diner, Lisa, money, Danny fading, November 2012 proposal, early twenties</w:t>
-      </w:r>
-    </w:p>
-    <w:p>
-      <w:r>
-        <w:rPr>
-          <w:b/>
-        </w:rPr>
-        <w:t>Entries 0676-0825:</w:t>
-      </w:r>
-      <w:r>
-        <w:t xml:space="preserve"> later twenties/early thirties; grandparents' deaths; Ray's illness; cancelled cruise; disability bureaucracy; nieces/nephews; COVID; social-work awakening; motherhood/aging questions</w:t>
-      </w:r>
-    </w:p>
-    <w:p>
-      <w:r>
-        <w:rPr>
-          <w:b/>
-        </w:rPr>
-        <w:t>Entries 0826-0925:</w:t>
-      </w:r>
-      <w:r>
-        <w:t xml:space="preserve"> EXIT account; decision to leave; family conflict/tenderness; June 2025 departure; Charleston arrival; hotel; finding/buying boat</w:t>
-      </w:r>
-    </w:p>
-    <w:p>
-      <w:r>
-        <w:rPr>
-          <w:b/>
-        </w:rPr>
-        <w:t>Entries 0926-1000:</w:t>
-      </w:r>
-      <w:r>
-        <w:t xml:space="preserve"> 2025-October 2026 Charleston life in high resolution; school, work, marina, repairs, Marisol, Eli, Nina Patel, present self</w:t>
-      </w:r>
-    </w:p>
-    <w:p/>
-    <w:p>
-      <w:pPr>
-        <w:pStyle w:val="Heading1"/>
-      </w:pPr>
-      <w:r>
-        <w:t>END-OF-DIARY FACT APPENDIX</w:t>
-      </w:r>
-    </w:p>
-    <w:p>
-      <w:r>
-        <w:t>The final master DOCX should end with a private factual reference written in Tammy's own voice or as her own personal record, covering at minimum:</w:t>
-      </w:r>
-    </w:p>
-    <w:p>
-      <w:pPr>
-        <w:pStyle w:val="ListBullet"/>
-      </w:pPr>
-      <w:r>
-        <w:t>full name, birth date/place, age</w:t>
-      </w:r>
-    </w:p>
-    <w:p>
-      <w:pPr>
-        <w:pStyle w:val="ListBullet"/>
-      </w:pPr>
-      <w:r>
-        <w:t>parents, brothers, grandparents, cousins with birthdays and relationships</w:t>
-      </w:r>
-    </w:p>
-    <w:p>
-      <w:pPr>
-        <w:pStyle w:val="ListBullet"/>
-      </w:pPr>
-      <w:r>
-        <w:t>important friends/teachers/coworkers</w:t>
-      </w:r>
-    </w:p>
-    <w:p>
-      <w:pPr>
-        <w:pStyle w:val="ListBullet"/>
-      </w:pPr>
-      <w:r>
-        <w:t>former and current addresses</w:t>
-      </w:r>
-    </w:p>
-    <w:p>
-      <w:pPr>
-        <w:pStyle w:val="ListBullet"/>
-      </w:pPr>
-      <w:r>
-        <w:t>phone/email</w:t>
-      </w:r>
-    </w:p>
-    <w:p>
-      <w:pPr>
-        <w:pStyle w:val="ListBullet"/>
-      </w:pPr>
-      <w:r>
-        <w:t>school history and current classes</w:t>
-      </w:r>
-    </w:p>
-    <w:p>
-      <w:pPr>
-        <w:pStyle w:val="ListBullet"/>
-      </w:pPr>
-      <w:r>
-        <w:t>work history, current employer, wage/salary, usual schedule</w:t>
-      </w:r>
-    </w:p>
-    <w:p>
-      <w:pPr>
-        <w:pStyle w:val="ListBullet"/>
-      </w:pPr>
-      <w:r>
-        <w:t>vehicle and boat details including financing/payment</w:t>
-      </w:r>
-    </w:p>
-    <w:p>
-      <w:pPr>
-        <w:pStyle w:val="ListBullet"/>
-      </w:pPr>
-      <w:r>
-        <w:t>medical/emergency basics that are actually established in the diary</w:t>
-      </w:r>
-    </w:p>
-    <w:p>
-      <w:pPr>
-        <w:pStyle w:val="ListBullet"/>
-      </w:pPr>
-      <w:r>
-        <w:t>important dates (expulsion, graduation, Danny chronology, Ray heart attack, Charleston move, boat purchase)</w:t>
-      </w:r>
-    </w:p>
-    <w:p>
-      <w:pPr>
-        <w:pStyle w:val="ListBullet"/>
-      </w:pPr>
-      <w:r>
-        <w:t>favorite music/books/sports and stable preferences</w:t>
-      </w:r>
-    </w:p>
-    <w:p>
-      <w:pPr>
-        <w:pStyle w:val="ListBullet"/>
-      </w:pPr>
-      <w:r>
-        <w:t>current goals and next expected milestones</w:t>
+        <w:t>The biggest change in Charleston is not that I became somebody else. I started spending some of my competence on my own life.</w:t>
       </w:r>
     </w:p>
     <w:sectPr>
       <w:footerReference w:type="default" r:id="rId9"/>
       <w:pgSz w:w="12240" w:h="15840"/>
-      <w:pgMar w:top="936" w:right="1008" w:bottom="936" w:left="1008" w:header="720" w:footer="720" w:gutter="0"/>
+      <w:pgMar w:top="936" w:right="1080" w:bottom="936" w:left="1080" w:header="720" w:footer="720" w:gutter="0"/>
       <w:cols w:space="720"/>
       <w:docGrid w:linePitch="360"/>
     </w:sectPr>
@@ -3023,14 +917,12 @@
   <w:p>
     <w:pPr>
       <w:pStyle w:val="Footer"/>
-      <w:jc w:val="center"/>
+      <w:jc w:val="right"/>
     </w:pPr>
     <w:r>
-      <w:rPr>
-        <w:sz w:val="16"/>
-      </w:rPr>
-      <w:t>Tammy Lynn Mercer — V3.1 private fictional character reference</w:t>
+      <w:t xml:space="preserve">Page </w:t>
     </w:r>
+    <w:fldSimple w:instr="PAGE"/>
   </w:p>
 </w:ftr>
 </file>
@@ -3399,11 +1291,11 @@
     <w:qFormat/>
     <w:rsid w:val="00FC693F"/>
     <w:pPr>
-      <w:spacing w:after="100"/>
+      <w:spacing w:after="80" w:line="245" w:lineRule="auto"/>
     </w:pPr>
     <w:rPr>
-      <w:rFonts w:ascii="Aptos" w:hAnsi="Aptos"/>
-      <w:sz w:val="21"/>
+      <w:rFonts w:ascii="Arial" w:hAnsi="Arial"/>
+      <w:sz w:val="20"/>
     </w:rPr>
   </w:style>
   <w:style w:type="paragraph" w:styleId="Header">
@@ -3461,11 +1353,11 @@
     <w:pPr>
       <w:keepNext/>
       <w:keepLines/>
-      <w:spacing w:before="200" w:after="80"/>
+      <w:spacing w:before="480" w:after="0"/>
       <w:outlineLvl w:val="0"/>
     </w:pPr>
     <w:rPr>
-      <w:rFonts w:asciiTheme="majorHAnsi" w:eastAsiaTheme="majorEastAsia" w:hAnsiTheme="majorHAnsi" w:cstheme="majorBidi" w:ascii="Aptos Display" w:hAnsi="Aptos Display"/>
+      <w:rFonts w:asciiTheme="majorHAnsi" w:eastAsiaTheme="majorEastAsia" w:hAnsiTheme="majorHAnsi" w:cstheme="majorBidi" w:ascii="Arial" w:hAnsi="Arial"/>
       <w:b/>
       <w:bCs/>
       <w:color w:val="365F91" w:themeColor="accent1" w:themeShade="BF"/>
@@ -3485,15 +1377,15 @@
     <w:pPr>
       <w:keepNext/>
       <w:keepLines/>
-      <w:spacing w:before="160" w:after="60"/>
+      <w:spacing w:before="200" w:after="0"/>
       <w:outlineLvl w:val="1"/>
     </w:pPr>
     <w:rPr>
-      <w:rFonts w:asciiTheme="majorHAnsi" w:eastAsiaTheme="majorEastAsia" w:hAnsiTheme="majorHAnsi" w:cstheme="majorBidi" w:ascii="Aptos Display" w:hAnsi="Aptos Display"/>
+      <w:rFonts w:asciiTheme="majorHAnsi" w:eastAsiaTheme="majorEastAsia" w:hAnsiTheme="majorHAnsi" w:cstheme="majorBidi" w:ascii="Arial" w:hAnsi="Arial"/>
       <w:b/>
       <w:bCs/>
       <w:color w:val="4F81BD" w:themeColor="accent1"/>
-      <w:sz w:val="24"/>
+      <w:sz w:val="22"/>
       <w:szCs w:val="26"/>
     </w:rPr>
   </w:style>
@@ -3754,7 +1646,7 @@
       <w:contextualSpacing/>
     </w:pPr>
     <w:rPr>
-      <w:rFonts w:asciiTheme="majorHAnsi" w:eastAsiaTheme="majorEastAsia" w:hAnsiTheme="majorHAnsi" w:cstheme="majorBidi" w:ascii="Aptos Display" w:hAnsi="Aptos Display"/>
+      <w:rFonts w:asciiTheme="majorHAnsi" w:eastAsiaTheme="majorEastAsia" w:hAnsiTheme="majorHAnsi" w:cstheme="majorBidi" w:ascii="Arial" w:hAnsi="Arial"/>
       <w:b/>
       <w:color w:val="17365D" w:themeColor="text2" w:themeShade="BF"/>
       <w:spacing w:val="5"/>

</xml_diff>